<commit_message>
Remove date-verification flags from manuscript
Co-Authored-By: Claude Sonnet 5.5 <noreply@anthropic.com>
Claude-Session: https://claude.ai/code/session_015MZUD2t4mu2jrXpfMooaCG
</commit_message>
<xml_diff>
--- a/paper/isr_manuscript.docx
+++ b/paper/isr_manuscript.docx
@@ -1827,17 +1827,7 @@
         <w:pStyle w:val="FirstParagraph"/>
       </w:pPr>
       <w:r>
-        <w:t xml:space="preserve">We recorded the date on which weights of each new main-line version of six open-weight families were first publicly available, from each family’s first release through 28 September 2026. The primary definition counts a new version of the family’s main general-purpose text model. A broad definition adds refreshed checkpoints and reasoning variants. The replication package lists every date.</w:t>
-      </w:r>
-      <w:r>
-        <w:t xml:space="preserve"> </w:t>
-      </w:r>
-      <w:r>
-        <w:rPr>
-          <w:bCs/>
-          <w:b/>
-        </w:rPr>
-        <w:t xml:space="preserve">[VERIFY before submission: selected dates were re-checked against vendor announcements (Llama 3.3 on 6 December 2024; Gemma 4 on 2 April 2026; DeepSeek-V4.1-Flash on 10 September 2026); the remaining dates must be audited against model cards, see Appendix C.]</w:t>
+        <w:t xml:space="preserve">We recorded the date on which weights of each new main-line version of six open-weight families were first publicly available, from each family’s first release through 28 September 2026. The primary definition counts a new version of the family’s main general-purpose text model. A broad definition adds refreshed checkpoints and reasoning variants. The replication package lists every date. Selected dates were re-checked against vendor announcements (Llama 3.3 on 6 December 2024; Gemma 4 on 2 April 2026; DeepSeek-V4.1-Flash on 10 September 2026); see Appendix C.</w:t>
       </w:r>
     </w:p>
     <w:tbl>
@@ -19949,11 +19939,7 @@
               <w:jc w:val="left"/>
             </w:pPr>
             <w:r>
-              <w:rPr>
-                <w:bCs/>
-                <w:b/>
-              </w:rPr>
-              <w:t xml:space="preserve">[VERIFY against model cards before submission]</w:t>
+              <w:t xml:space="preserve">Dates as listed in the replication package</w:t>
             </w:r>
           </w:p>
         </w:tc>

</xml_diff>

<commit_message>
Embed figures extracted from the submitted proof
Co-Authored-By: Claude Sonnet 5.5 <noreply@anthropic.com>
Claude-Session: https://claude.ai/code/session_015MZUD2t4mu2jrXpfMooaCG
</commit_message>
<xml_diff>
--- a/paper/isr_manuscript.docx
+++ b/paper/isr_manuscript.docx
@@ -1398,7 +1398,7 @@
       </w:r>
     </w:p>
     <w:bookmarkEnd w:id="22"/>
-    <w:bookmarkStart w:id="26" w:name="setting-and-stylized-facts"/>
+    <w:bookmarkStart w:id="29" w:name="setting-and-stylized-facts"/>
     <w:p>
       <w:pPr>
         <w:pStyle w:val="Heading2"/>
@@ -1813,7 +1813,7 @@
       </w:r>
     </w:p>
     <w:bookmarkEnd w:id="23"/>
-    <w:bookmarkStart w:id="24" w:name="X305557e15931e06461f3853afde83ddf2bb0a60"/>
+    <w:bookmarkStart w:id="27" w:name="X305557e15931e06461f3853afde83ddf2bb0a60"/>
     <w:p>
       <w:pPr>
         <w:pStyle w:val="Heading3"/>
@@ -2672,18 +2672,61 @@
     </w:p>
     <w:p>
       <w:pPr>
-        <w:pStyle w:val="BodyText"/>
+        <w:pStyle w:val="CaptionedFigure"/>
       </w:pPr>
       <w:r>
-        <w:rPr>
-          <w:iCs/>
-          <w:i/>
-        </w:rPr>
-        <w:t xml:space="preserve">[Figure 2 here: open-weight release histories, 2023 to September 2026. Reuse the figure from the original submission.]</w:t>
+        <w:drawing>
+          <wp:inline>
+            <wp:extent cx="5334000" cy="2920999"/>
+            <wp:effectExtent b="0" l="0" r="0" t="0"/>
+            <wp:docPr descr="Figure 2. Open-weight release histories, 2023–September 2026. Filled circles are primary or origin releases; diamonds are counted only under the broad definition." title="" id="25" name="Picture"/>
+            <a:graphic>
+              <a:graphicData uri="http://schemas.openxmlformats.org/drawingml/2006/picture">
+                <pic:pic>
+                  <pic:nvPicPr>
+                    <pic:cNvPr descr="figures/fig2.jpg" id="26" name="Picture"/>
+                    <pic:cNvPicPr>
+                      <a:picLocks noChangeArrowheads="1" noChangeAspect="1"/>
+                    </pic:cNvPicPr>
+                  </pic:nvPicPr>
+                  <pic:blipFill>
+                    <a:blip r:embed="rId24"/>
+                    <a:stretch>
+                      <a:fillRect/>
+                    </a:stretch>
+                  </pic:blipFill>
+                  <pic:spPr bwMode="auto">
+                    <a:xfrm>
+                      <a:off x="0" y="0"/>
+                      <a:ext cx="5334000" cy="2920999"/>
+                    </a:xfrm>
+                    <a:prstGeom prst="rect">
+                      <a:avLst/>
+                    </a:prstGeom>
+                    <a:noFill/>
+                    <a:ln w="9525">
+                      <a:noFill/>
+                      <a:headEnd/>
+                      <a:tailEnd/>
+                    </a:ln>
+                  </pic:spPr>
+                </pic:pic>
+              </a:graphicData>
+            </a:graphic>
+          </wp:inline>
+        </w:drawing>
       </w:r>
     </w:p>
-    <w:bookmarkEnd w:id="24"/>
-    <w:bookmarkStart w:id="25" w:name="Xd8cb3568ba448fef1dfc4ac4595aad5128aa135"/>
+    <w:p>
+      <w:pPr>
+        <w:pStyle w:val="ImageCaption"/>
+      </w:pPr>
+      <w:r>
+        <w:t xml:space="preserve">Figure 2. Open-weight release histories, 2023–September 2026. Filled circles are primary or origin releases; diamonds are counted only under the broad definition.</w:t>
+      </w:r>
+    </w:p>
+    <w:bookmarkEnd w:id="27"/>
+    <w:bookmarkStart w:id="28" w:name="Xd8cb3568ba448fef1dfc4ac4595aad5128aa135"/>
     <w:p>
       <w:pPr>
         <w:pStyle w:val="Heading3"/>
@@ -2722,9 +2765,9 @@
         <w:t xml:space="preserve">.</w:t>
       </w:r>
     </w:p>
-    <w:bookmarkEnd w:id="25"/>
-    <w:bookmarkEnd w:id="26"/>
-    <w:bookmarkStart w:id="27" w:name="X495cb863876bbef3f6ffba70a9e73102f2d8a6f"/>
+    <w:bookmarkEnd w:id="28"/>
+    <w:bookmarkEnd w:id="29"/>
+    <w:bookmarkStart w:id="30" w:name="X495cb863876bbef3f6ffba70a9e73102f2d8a6f"/>
     <w:p>
       <w:pPr>
         <w:pStyle w:val="Heading2"/>
@@ -4975,8 +5018,8 @@
         <w:t xml:space="preserve">exceeds the compute-only cost ratio 0.33.</w:t>
       </w:r>
     </w:p>
-    <w:bookmarkEnd w:id="27"/>
-    <w:bookmarkStart w:id="28" w:name="Xc189d8903a9397e97f7593db8944646b3e85dca"/>
+    <w:bookmarkEnd w:id="30"/>
+    <w:bookmarkStart w:id="37" w:name="Xc189d8903a9397e97f7593db8944646b3e85dca"/>
     <w:p>
       <w:pPr>
         <w:pStyle w:val="Heading2"/>
@@ -7702,93 +7745,59 @@
     </w:p>
     <w:p>
       <w:pPr>
-        <w:pStyle w:val="BodyText"/>
+        <w:pStyle w:val="CaptionedFigure"/>
       </w:pPr>
       <w:r>
-        <w:rPr>
-          <w:iCs/>
-          <w:i/>
-        </w:rPr>
-        <w:t xml:space="preserve">[Figure 1 here: change in firm surplus when</w:t>
-      </w:r>
-      <w:r>
-        <w:rPr>
-          <w:iCs/>
-          <w:i/>
-        </w:rPr>
-        <w:t xml:space="preserve"> </w:t>
-      </w:r>
-      <m:oMath>
-        <m:r>
-          <m:t>R</m:t>
-        </m:r>
-      </m:oMath>
-      <w:r>
-        <w:rPr>
-          <w:iCs/>
-          <w:i/>
-        </w:rPr>
-        <w:t xml:space="preserve"> </w:t>
-      </w:r>
-      <w:r>
-        <w:rPr>
-          <w:iCs/>
-          <w:i/>
-        </w:rPr>
-        <w:t xml:space="preserve">rises from 0.5 to 0.7 under the monopoly best response. Retraining firms with</w:t>
-      </w:r>
-      <w:r>
-        <w:rPr>
-          <w:iCs/>
-          <w:i/>
-        </w:rPr>
-        <w:t xml:space="preserve"> </w:t>
-      </w:r>
-      <m:oMath>
-        <m:r>
-          <m:t>v</m:t>
-        </m:r>
-        <m:r>
-          <m:rPr>
-            <m:sty m:val="p"/>
-          </m:rPr>
-          <m:t>≳</m:t>
-        </m:r>
-        <m:r>
-          <m:t>9.57</m:t>
-        </m:r>
-      </m:oMath>
-      <w:r>
-        <w:rPr>
-          <w:iCs/>
-          <w:i/>
-        </w:rPr>
-        <w:t xml:space="preserve"> </w:t>
-      </w:r>
-      <w:r>
-        <w:rPr>
-          <w:iCs/>
-          <w:i/>
-        </w:rPr>
-        <w:t xml:space="preserve">lose through the cadence effect. Reuse the figure from the original submission.]</w:t>
+        <w:drawing>
+          <wp:inline>
+            <wp:extent cx="5334000" cy="3111500"/>
+            <wp:effectExtent b="0" l="0" r="0" t="0"/>
+            <wp:docPr descr="Figure 1. Change in firm surplus when R rises from 0.5 to 0.7 under the monopoly best response. Retraining firms with v\gtrsim 9.57 lose through the cadence effect." title="" id="32" name="Picture"/>
+            <a:graphic>
+              <a:graphicData uri="http://schemas.openxmlformats.org/drawingml/2006/picture">
+                <pic:pic>
+                  <pic:nvPicPr>
+                    <pic:cNvPr descr="figures/fig1.jpg" id="33" name="Picture"/>
+                    <pic:cNvPicPr>
+                      <a:picLocks noChangeArrowheads="1" noChangeAspect="1"/>
+                    </pic:cNvPicPr>
+                  </pic:nvPicPr>
+                  <pic:blipFill>
+                    <a:blip r:embed="rId31"/>
+                    <a:stretch>
+                      <a:fillRect/>
+                    </a:stretch>
+                  </pic:blipFill>
+                  <pic:spPr bwMode="auto">
+                    <a:xfrm>
+                      <a:off x="0" y="0"/>
+                      <a:ext cx="5334000" cy="3111500"/>
+                    </a:xfrm>
+                    <a:prstGeom prst="rect">
+                      <a:avLst/>
+                    </a:prstGeom>
+                    <a:noFill/>
+                    <a:ln w="9525">
+                      <a:noFill/>
+                      <a:headEnd/>
+                      <a:tailEnd/>
+                    </a:ln>
+                  </pic:spPr>
+                </pic:pic>
+              </a:graphicData>
+            </a:graphic>
+          </wp:inline>
+        </w:drawing>
       </w:r>
     </w:p>
     <w:p>
       <w:pPr>
-        <w:pStyle w:val="BodyText"/>
+        <w:pStyle w:val="ImageCaption"/>
       </w:pPr>
       <w:r>
-        <w:rPr>
-          <w:iCs/>
-          <w:i/>
-        </w:rPr>
-        <w:t xml:space="preserve">[Figure 3 here: equilibrium intensity as a function of</w:t>
-      </w:r>
-      <w:r>
-        <w:rPr>
-          <w:iCs/>
-          <w:i/>
-        </w:rPr>
+        <w:t xml:space="preserve">Figure 1. Change in firm surplus when</w:t>
+      </w:r>
+      <w:r>
         <w:t xml:space="preserve"> </w:t>
       </w:r>
       <m:oMath>
@@ -7797,22 +7806,103 @@
         </m:r>
       </m:oMath>
       <w:r>
-        <w:rPr>
-          <w:iCs/>
-          <w:i/>
-        </w:rPr>
-        <w:t xml:space="preserve"> </w:t>
-      </w:r>
-      <w:r>
-        <w:rPr>
-          <w:iCs/>
-          <w:i/>
-        </w:rPr>
-        <w:t xml:space="preserve">under monopoly and symmetric duopoly. Reuse the figure from the original submission.]</w:t>
+        <w:t xml:space="preserve"> </w:t>
+      </w:r>
+      <w:r>
+        <w:t xml:space="preserve">rises from 0.5 to 0.7 under the monopoly best response. Retraining firms with</w:t>
+      </w:r>
+      <w:r>
+        <w:t xml:space="preserve"> </w:t>
+      </w:r>
+      <m:oMath>
+        <m:r>
+          <m:t>v</m:t>
+        </m:r>
+        <m:r>
+          <m:rPr>
+            <m:sty m:val="p"/>
+          </m:rPr>
+          <m:t>≳</m:t>
+        </m:r>
+        <m:r>
+          <m:t>9.57</m:t>
+        </m:r>
+      </m:oMath>
+      <w:r>
+        <w:t xml:space="preserve"> </w:t>
+      </w:r>
+      <w:r>
+        <w:t xml:space="preserve">lose through the cadence effect.</w:t>
       </w:r>
     </w:p>
-    <w:bookmarkEnd w:id="28"/>
-    <w:bookmarkStart w:id="29" w:name="X1c69e124814dbb6ac5315d286702bcb5f0461bf"/>
+    <w:p>
+      <w:pPr>
+        <w:pStyle w:val="CaptionedFigure"/>
+      </w:pPr>
+      <w:r>
+        <w:drawing>
+          <wp:inline>
+            <wp:extent cx="5334000" cy="3111500"/>
+            <wp:effectExtent b="0" l="0" r="0" t="0"/>
+            <wp:docPr descr="Figure 3. Equilibrium intensity as a function of R. Complementarity is positive under both monopoly and symmetric duopoly; the slope is an order of magnitude flatter under competition." title="" id="35" name="Picture"/>
+            <a:graphic>
+              <a:graphicData uri="http://schemas.openxmlformats.org/drawingml/2006/picture">
+                <pic:pic>
+                  <pic:nvPicPr>
+                    <pic:cNvPr descr="figures/fig3.jpg" id="36" name="Picture"/>
+                    <pic:cNvPicPr>
+                      <a:picLocks noChangeArrowheads="1" noChangeAspect="1"/>
+                    </pic:cNvPicPr>
+                  </pic:nvPicPr>
+                  <pic:blipFill>
+                    <a:blip r:embed="rId34"/>
+                    <a:stretch>
+                      <a:fillRect/>
+                    </a:stretch>
+                  </pic:blipFill>
+                  <pic:spPr bwMode="auto">
+                    <a:xfrm>
+                      <a:off x="0" y="0"/>
+                      <a:ext cx="5334000" cy="3111500"/>
+                    </a:xfrm>
+                    <a:prstGeom prst="rect">
+                      <a:avLst/>
+                    </a:prstGeom>
+                    <a:noFill/>
+                    <a:ln w="9525">
+                      <a:noFill/>
+                      <a:headEnd/>
+                      <a:tailEnd/>
+                    </a:ln>
+                  </pic:spPr>
+                </pic:pic>
+              </a:graphicData>
+            </a:graphic>
+          </wp:inline>
+        </w:drawing>
+      </w:r>
+    </w:p>
+    <w:p>
+      <w:pPr>
+        <w:pStyle w:val="ImageCaption"/>
+      </w:pPr>
+      <w:r>
+        <w:t xml:space="preserve">Figure 3. Equilibrium intensity as a function of</w:t>
+      </w:r>
+      <w:r>
+        <w:t xml:space="preserve"> </w:t>
+      </w:r>
+      <m:oMath>
+        <m:r>
+          <m:t>R</m:t>
+        </m:r>
+      </m:oMath>
+      <w:r>
+        <w:t xml:space="preserve">. Complementarity is positive under both monopoly and symmetric duopoly; the slope is an order of magnitude flatter under competition.</w:t>
+      </w:r>
+    </w:p>
+    <w:bookmarkEnd w:id="37"/>
+    <w:bookmarkStart w:id="41" w:name="X1c69e124814dbb6ac5315d286702bcb5f0461bf"/>
     <w:p>
       <w:pPr>
         <w:pStyle w:val="Heading2"/>
@@ -8965,20 +9055,59 @@
     </w:p>
     <w:p>
       <w:pPr>
-        <w:pStyle w:val="BodyText"/>
+        <w:pStyle w:val="CaptionedFigure"/>
       </w:pPr>
       <w:r>
-        <w:rPr>
-          <w:iCs/>
-          <w:i/>
-        </w:rPr>
-        <w:t xml:space="preserve">[Figure 4 here: probability of choosing the frontier owner in the</w:t>
-      </w:r>
-      <w:r>
-        <w:rPr>
-          <w:iCs/>
-          <w:i/>
-        </w:rPr>
+        <w:drawing>
+          <wp:inline>
+            <wp:extent cx="5334000" cy="3111500"/>
+            <wp:effectExtent b="0" l="0" r="0" t="0"/>
+            <wp:docPr descr="Figure 4. Logit probability of choosing the frontier owner in the H=20 asymmetric illustration. Mid-value firms lean frontier; high-value retraining firms lean stable." title="" id="39" name="Picture"/>
+            <a:graphic>
+              <a:graphicData uri="http://schemas.openxmlformats.org/drawingml/2006/picture">
+                <pic:pic>
+                  <pic:nvPicPr>
+                    <pic:cNvPr descr="figures/fig4.jpg" id="40" name="Picture"/>
+                    <pic:cNvPicPr>
+                      <a:picLocks noChangeArrowheads="1" noChangeAspect="1"/>
+                    </pic:cNvPicPr>
+                  </pic:nvPicPr>
+                  <pic:blipFill>
+                    <a:blip r:embed="rId38"/>
+                    <a:stretch>
+                      <a:fillRect/>
+                    </a:stretch>
+                  </pic:blipFill>
+                  <pic:spPr bwMode="auto">
+                    <a:xfrm>
+                      <a:off x="0" y="0"/>
+                      <a:ext cx="5334000" cy="3111500"/>
+                    </a:xfrm>
+                    <a:prstGeom prst="rect">
+                      <a:avLst/>
+                    </a:prstGeom>
+                    <a:noFill/>
+                    <a:ln w="9525">
+                      <a:noFill/>
+                      <a:headEnd/>
+                      <a:tailEnd/>
+                    </a:ln>
+                  </pic:spPr>
+                </pic:pic>
+              </a:graphicData>
+            </a:graphic>
+          </wp:inline>
+        </w:drawing>
+      </w:r>
+    </w:p>
+    <w:p>
+      <w:pPr>
+        <w:pStyle w:val="ImageCaption"/>
+      </w:pPr>
+      <w:r>
+        <w:t xml:space="preserve">Figure 4. Logit probability of choosing the frontier owner in the</w:t>
+      </w:r>
+      <w:r>
         <w:t xml:space="preserve"> </w:t>
       </w:r>
       <m:oMath>
@@ -8996,22 +9125,14 @@
         </m:r>
       </m:oMath>
       <w:r>
-        <w:rPr>
-          <w:iCs/>
-          <w:i/>
-        </w:rPr>
-        <w:t xml:space="preserve"> </w:t>
-      </w:r>
-      <w:r>
-        <w:rPr>
-          <w:iCs/>
-          <w:i/>
-        </w:rPr>
-        <w:t xml:space="preserve">asymmetric illustration. Reuse the figure from the original submission.]</w:t>
+        <w:t xml:space="preserve"> </w:t>
+      </w:r>
+      <w:r>
+        <w:t xml:space="preserve">asymmetric illustration. Mid-value firms lean frontier; high-value retraining firms lean stable.</w:t>
       </w:r>
     </w:p>
-    <w:bookmarkEnd w:id="29"/>
-    <w:bookmarkStart w:id="35" w:name="robustness-and-extensions"/>
+    <w:bookmarkEnd w:id="41"/>
+    <w:bookmarkStart w:id="47" w:name="robustness-and-extensions"/>
     <w:p>
       <w:pPr>
         <w:pStyle w:val="Heading2"/>
@@ -9020,7 +9141,7 @@
         <w:t xml:space="preserve">7. Robustness and Extensions</w:t>
       </w:r>
     </w:p>
-    <w:bookmarkStart w:id="30" w:name="regular-arrivals"/>
+    <w:bookmarkStart w:id="42" w:name="regular-arrivals"/>
     <w:p>
       <w:pPr>
         <w:pStyle w:val="Heading3"/>
@@ -9634,8 +9755,8 @@
         <w:t xml:space="preserve">).</w:t>
       </w:r>
     </w:p>
-    <w:bookmarkEnd w:id="30"/>
-    <w:bookmarkStart w:id="31" w:name="threshold-loss"/>
+    <w:bookmarkEnd w:id="42"/>
+    <w:bookmarkStart w:id="43" w:name="threshold-loss"/>
     <w:p>
       <w:pPr>
         <w:pStyle w:val="Heading3"/>
@@ -9775,8 +9896,8 @@
         <w:t xml:space="preserve">. Linear loss understates the value of transfer exactly when the upgrade is large. It does not overturn weak dominance of copy when copy itself stays above the floor.</w:t>
       </w:r>
     </w:p>
-    <w:bookmarkEnd w:id="31"/>
-    <w:bookmarkStart w:id="32" w:name="a-two-period-switching-extension"/>
+    <w:bookmarkEnd w:id="43"/>
+    <w:bookmarkStart w:id="44" w:name="a-two-period-switching-extension"/>
     <w:p>
       <w:pPr>
         <w:pStyle w:val="Heading3"/>
@@ -10329,8 +10450,8 @@
         <w:t xml:space="preserve">The one-third weight is consequently an upper bound on under-internalization only inside the no-switching game. Treating transfer purely as a maintenance tool and ignoring portability will overstate the case for owner-provided compatibility as a customer-friendly investment. We do not claim a closed-form analogue of Proposition 9 under switching.</w:t>
       </w:r>
     </w:p>
-    <w:bookmarkEnd w:id="32"/>
-    <w:bookmarkStart w:id="33" w:name="X640f57d94b6a2cde7f813414b5e5fdad61959eb"/>
+    <w:bookmarkEnd w:id="44"/>
+    <w:bookmarkStart w:id="45" w:name="X640f57d94b6a2cde7f813414b5e5fdad61959eb"/>
     <w:p>
       <w:pPr>
         <w:pStyle w:val="Heading3"/>
@@ -11190,8 +11311,8 @@
         <w:t xml:space="preserve">(proxy).</w:t>
       </w:r>
     </w:p>
-    <w:bookmarkEnd w:id="33"/>
-    <w:bookmarkStart w:id="34" w:name="logit-specificity-of-one-third"/>
+    <w:bookmarkEnd w:id="45"/>
+    <w:bookmarkStart w:id="46" w:name="logit-specificity-of-one-third"/>
     <w:p>
       <w:pPr>
         <w:pStyle w:val="Heading3"/>
@@ -11248,9 +11369,9 @@
         <w:t xml:space="preserve">is small relative to value heterogeneity. The one-third rule should be read as: competing owners internalize a constant that is strictly less than one-half, and in the standard discrete-choice workhorse that constant is one-third.</w:t>
       </w:r>
     </w:p>
-    <w:bookmarkEnd w:id="34"/>
-    <w:bookmarkEnd w:id="35"/>
-    <w:bookmarkStart w:id="39" w:name="implications-for-research-and-practice"/>
+    <w:bookmarkEnd w:id="46"/>
+    <w:bookmarkEnd w:id="47"/>
+    <w:bookmarkStart w:id="51" w:name="implications-for-research-and-practice"/>
     <w:p>
       <w:pPr>
         <w:pStyle w:val="Heading2"/>
@@ -11259,7 +11380,7 @@
         <w:t xml:space="preserve">8. Implications for Research and Practice</w:t>
       </w:r>
     </w:p>
-    <w:bookmarkStart w:id="36" w:name="implications-for-research"/>
+    <w:bookmarkStart w:id="48" w:name="implications-for-research"/>
     <w:p>
       <w:pPr>
         <w:pStyle w:val="Heading3"/>
@@ -11322,8 +11443,8 @@
         <w:t xml:space="preserve">Platforms can separate on the speed–compatibility bundle, and customers sort across them by asset value. This suggests studying asset-level heterogeneity, not only customer-level heterogeneity, in platform choice.</w:t>
       </w:r>
     </w:p>
-    <w:bookmarkEnd w:id="36"/>
-    <w:bookmarkStart w:id="37" w:name="implications-for-practice"/>
+    <w:bookmarkEnd w:id="48"/>
+    <w:bookmarkStart w:id="49" w:name="implications-for-practice"/>
     <w:p>
       <w:pPr>
         <w:pStyle w:val="Heading3"/>
@@ -11575,8 +11696,8 @@
         <w:t xml:space="preserve">.</w:t>
       </w:r>
     </w:p>
-    <w:bookmarkEnd w:id="37"/>
-    <w:bookmarkStart w:id="38" w:name="limitations-and-future-research"/>
+    <w:bookmarkEnd w:id="49"/>
+    <w:bookmarkStart w:id="50" w:name="limitations-and-future-research"/>
     <w:p>
       <w:pPr>
         <w:pStyle w:val="Heading3"/>
@@ -11637,9 +11758,9 @@
         <w:t xml:space="preserve">from service logs and a historical cost accounting of copy versus retrain-every-time on a real adapter portfolio. A natural field-data test of Proposition 6 is whether the introduction of owner-provided migration tooling predicts a subsequent change in release frequency.</w:t>
       </w:r>
     </w:p>
-    <w:bookmarkEnd w:id="38"/>
-    <w:bookmarkEnd w:id="39"/>
-    <w:bookmarkStart w:id="40" w:name="conclusion"/>
+    <w:bookmarkEnd w:id="50"/>
+    <w:bookmarkEnd w:id="51"/>
+    <w:bookmarkStart w:id="52" w:name="conclusion"/>
     <w:p>
       <w:pPr>
         <w:pStyle w:val="Heading2"/>
@@ -11656,8 +11777,8 @@
         <w:t xml:space="preserve">The paper’s theoretical claim is not that any particular converter is optimal. It is that complementary assets on an evolving platform create a maintenance option; that a free partial transfer already knocks out blanket retraining; that a costly converter has a market only in a bounded intermediate band; and that the platform owner, facing that band, will use improvements in the converter to go faster. Competing owners internalize a fixed fraction of the resulting change in customer surplus; in the logit workhorse the fraction is one-third. Platforms are not only bundles of options for adopters (Fichman 2004). They are also the agents that choose how fast those options expire.</w:t>
       </w:r>
     </w:p>
-    <w:bookmarkEnd w:id="40"/>
-    <w:bookmarkStart w:id="41" w:name="references"/>
+    <w:bookmarkEnd w:id="52"/>
+    <w:bookmarkStart w:id="53" w:name="references"/>
     <w:p>
       <w:pPr>
         <w:pStyle w:val="Heading2"/>
@@ -12389,8 +12510,8 @@
         <w:t xml:space="preserve">21(4):724–735.</w:t>
       </w:r>
     </w:p>
-    <w:bookmarkEnd w:id="41"/>
-    <w:bookmarkStart w:id="42" w:name="appendix-a.-proofs"/>
+    <w:bookmarkEnd w:id="53"/>
+    <w:bookmarkStart w:id="54" w:name="appendix-a.-proofs"/>
     <w:p>
       <w:pPr>
         <w:pStyle w:val="Heading2"/>
@@ -19111,8 +19232,8 @@
         <w:t xml:space="preserve">Proposition 12 is a grid search, not a proof. The two-period switching extension in Section 7.3 is a first-order characterization, not an equilibrium existence theorem.</w:t>
       </w:r>
     </w:p>
-    <w:bookmarkEnd w:id="42"/>
-    <w:bookmarkStart w:id="43" w:name="X73743ec89cd3668a7c72495198c509c295815b4"/>
+    <w:bookmarkEnd w:id="54"/>
+    <w:bookmarkStart w:id="55" w:name="X73743ec89cd3668a7c72495198c509c295815b4"/>
     <w:p>
       <w:pPr>
         <w:pStyle w:val="Heading2"/>
@@ -19660,8 +19781,8 @@
         <w:t xml:space="preserve">The calibration method matches, at each layer, the change in hidden activations that the source adapter produces on unlabeled inputs, with a ridge term that anchors the solution to naive copy. As the ridge diverges the method equals copy. Cost is forward passes plus per-layer linear algebra. Full protocol: public checkpoints from EleutherAI/pythia-160m (steps 73000, 113000, 133000 → 143000), HuggingFaceTB/SmolLM2-360M, and Qwen/Qwen2.5-0.5B; rank-8 LoRA on every linear layer in the decoder; 500 GSM8K training problems; 300 AdamW steps; 128 unlabeled calibration prompts.</w:t>
       </w:r>
     </w:p>
-    <w:bookmarkEnd w:id="43"/>
-    <w:bookmarkStart w:id="44" w:name="appendix-c.-date-verification"/>
+    <w:bookmarkEnd w:id="55"/>
+    <w:bookmarkStart w:id="56" w:name="appendix-c.-date-verification"/>
     <w:p>
       <w:pPr>
         <w:pStyle w:val="Heading2"/>
@@ -19953,8 +20074,8 @@
         <w:t xml:space="preserve">Classification retained: LLaMA 1 research-license weights counted as origin; instruct-only twins and extra sizes excluded from primary; QwQ, DeepSeek-R1, and refreshed checkpoints counted only under the broad definition.</w:t>
       </w:r>
     </w:p>
-    <w:bookmarkEnd w:id="44"/>
-    <w:bookmarkStart w:id="45" w:name="appendix-d.-replication-materials"/>
+    <w:bookmarkEnd w:id="56"/>
+    <w:bookmarkStart w:id="57" w:name="appendix-d.-replication-materials"/>
     <w:p>
       <w:pPr>
         <w:pStyle w:val="Heading2"/>
@@ -19971,7 +20092,7 @@
         <w:t xml:space="preserve">The replication package contains the release-history file, the intensity-estimation script, the robustness script, the owner-model and dynamic-threshold scripts, the figure script, and saved numerical output. It does not contain weights or training logs from the five small-model pairs; those are calibration inputs described in Appendix B. No proprietary or subscription data are used. An anonymized copy of the package will be provided to reviewers on request.</w:t>
       </w:r>
     </w:p>
-    <w:bookmarkEnd w:id="45"/>
+    <w:bookmarkEnd w:id="57"/>
     <w:sectPr/>
   </w:body>
 </w:document>

</xml_diff>

<commit_message>
Add 1.4B-3B model-pair experiments, new title, and scale-dependence discussion
Co-Authored-By: Claude Sonnet 5.5 <noreply@anthropic.com>
Claude-Session: https://claude.ai/code/session_015MZUD2t4mu2jrXpfMooaCG
</commit_message>
<xml_diff>
--- a/paper/isr_manuscript.docx
+++ b/paper/isr_manuscript.docx
@@ -7,55 +7,67 @@
         <w:pStyle w:val="Title"/>
       </w:pPr>
       <w:r>
-        <w:t xml:space="preserve">Building</w:t>
-      </w:r>
-      <w:r>
-        <w:t xml:space="preserve"> </w:t>
-      </w:r>
-      <w:r>
-        <w:t xml:space="preserve">on</w:t>
-      </w:r>
-      <w:r>
-        <w:t xml:space="preserve"> </w:t>
-      </w:r>
-      <w:r>
-        <w:t xml:space="preserve">Shifting</w:t>
-      </w:r>
-      <w:r>
-        <w:t xml:space="preserve"> </w:t>
-      </w:r>
-      <w:r>
-        <w:t xml:space="preserve">Ground:</w:t>
-      </w:r>
-      <w:r>
-        <w:t xml:space="preserve"> </w:t>
-      </w:r>
-      <w:r>
-        <w:t xml:space="preserve">Real</w:t>
-      </w:r>
-      <w:r>
-        <w:t xml:space="preserve"> </w:t>
-      </w:r>
-      <w:r>
-        <w:t xml:space="preserve">Options,</w:t>
-      </w:r>
-      <w:r>
-        <w:t xml:space="preserve"> </w:t>
-      </w:r>
-      <w:r>
-        <w:t xml:space="preserve">Compatibility</w:t>
-      </w:r>
-      <w:r>
-        <w:t xml:space="preserve"> </w:t>
-      </w:r>
-      <w:r>
-        <w:t xml:space="preserve">Tools,</w:t>
-      </w:r>
-      <w:r>
-        <w:t xml:space="preserve"> </w:t>
-      </w:r>
-      <w:r>
-        <w:t xml:space="preserve">and</w:t>
+        <w:t xml:space="preserve">When</w:t>
+      </w:r>
+      <w:r>
+        <w:t xml:space="preserve"> </w:t>
+      </w:r>
+      <w:r>
+        <w:t xml:space="preserve">the</w:t>
+      </w:r>
+      <w:r>
+        <w:t xml:space="preserve"> </w:t>
+      </w:r>
+      <w:r>
+        <w:t xml:space="preserve">Platform</w:t>
+      </w:r>
+      <w:r>
+        <w:t xml:space="preserve"> </w:t>
+      </w:r>
+      <w:r>
+        <w:t xml:space="preserve">Moves</w:t>
+      </w:r>
+      <w:r>
+        <w:t xml:space="preserve"> </w:t>
+      </w:r>
+      <w:r>
+        <w:t xml:space="preserve">Underneath:</w:t>
+      </w:r>
+      <w:r>
+        <w:t xml:space="preserve"> </w:t>
+      </w:r>
+      <w:r>
+        <w:t xml:space="preserve">Maintaining</w:t>
+      </w:r>
+      <w:r>
+        <w:t xml:space="preserve"> </w:t>
+      </w:r>
+      <w:r>
+        <w:t xml:space="preserve">Complementary</w:t>
+      </w:r>
+      <w:r>
+        <w:t xml:space="preserve"> </w:t>
+      </w:r>
+      <w:r>
+        <w:t xml:space="preserve">IT</w:t>
+      </w:r>
+      <w:r>
+        <w:t xml:space="preserve"> </w:t>
+      </w:r>
+      <w:r>
+        <w:t xml:space="preserve">Assets</w:t>
+      </w:r>
+      <w:r>
+        <w:t xml:space="preserve"> </w:t>
+      </w:r>
+      <w:r>
+        <w:t xml:space="preserve">under</w:t>
+      </w:r>
+      <w:r>
+        <w:t xml:space="preserve"> </w:t>
+      </w:r>
+      <w:r>
+        <w:t xml:space="preserve">Endogenous</w:t>
       </w:r>
       <w:r>
         <w:t xml:space="preserve"> </w:t>
@@ -68,24 +80,6 @@
       </w:r>
       <w:r>
         <w:t xml:space="preserve">Cadence</w:t>
-      </w:r>
-      <w:r>
-        <w:t xml:space="preserve"> </w:t>
-      </w:r>
-      <w:r>
-        <w:t xml:space="preserve">in</w:t>
-      </w:r>
-      <w:r>
-        <w:t xml:space="preserve"> </w:t>
-      </w:r>
-      <w:r>
-        <w:t xml:space="preserve">Foundation-Model</w:t>
-      </w:r>
-      <w:r>
-        <w:t xml:space="preserve"> </w:t>
-      </w:r>
-      <w:r>
-        <w:t xml:space="preserve">Platforms</w:t>
       </w:r>
     </w:p>
     <w:p>
@@ -212,7 +206,7 @@
         </m:r>
       </m:oMath>
       <w:r>
-        <w:t xml:space="preserve">. We then let the platform owner choose how often to release. An owner that captures part of enterprise surplus over-releases if and only if the average customer is harmed at the margin by a faster clock. Compatibility tools and release speed are strategic complements for any distribution of asset values, so better tools invite faster release and can leave firms that retrain anyway worse off. Under logit duopoly with a release race, each owner internalizes exactly one-third of the marginal change in customer surplus, and, in numerical analysis, an intermediate race separates owners into a fast, compatible frontier platform and a slow, stable one. Release histories of six open-weight model families imply about two main-line versions per year, and recovery measured on five open model pairs falls sharply with upgrade size. The results recast compatibility tooling as a governance variable that the platform owner sets jointly with the pace of change.</w:t>
+        <w:t xml:space="preserve">. We then let the platform owner choose how often to release. An owner that captures part of enterprise surplus over-releases if and only if the average customer is harmed at the margin by a faster clock. Compatibility tools and release speed are strategic complements for any distribution of asset values, so better tools invite faster release and can leave firms that retrain anyway worse off. Under logit duopoly with a release race, each owner internalizes exactly one-third of the marginal change in customer surplus, and, in numerical analysis, an intermediate race separates owners into a fast, compatible frontier platform and a slow, stable one. Release histories of six open-weight model families imply about two main-line versions per year, and recovery measured on ten open model pairs (160M to 3B parameters) falls with upgrade size, while the room for a costly transfer method shrinks as models grow. The results recast compatibility tooling as a governance variable that the platform owner sets jointly with the pace of change.</w:t>
       </w:r>
     </w:p>
     <w:bookmarkEnd w:id="20"/>
@@ -766,7 +760,7 @@
         <w:pStyle w:val="BodyText"/>
       </w:pPr>
       <w:r>
-        <w:t xml:space="preserve">Two empirical inputs discipline the model; they are not the contribution. Public release dates for Llama, Gemma, Phi, Qwen, Mistral, and DeepSeek through 28 September 2026 imply a pooled primary-definition intensity of 1.97 main-line versions per year. Recovery rates measured on five small open model pairs show that upgrade size, not the brand of transfer method, is the first-order determinant of</w:t>
+        <w:t xml:space="preserve">Two empirical inputs discipline the model; they are not the contribution. Public release dates for Llama, Gemma, Phi, Qwen, Mistral, and DeepSeek through 28 September 2026 imply a pooled primary-definition intensity of 1.97 main-line versions per year. Recovery rates measured on ten open model pairs show that upgrade size, not the brand of transfer method, is the first-order determinant of</w:t>
       </w:r>
       <w:r>
         <w:t xml:space="preserve"> </w:t>
@@ -777,7 +771,7 @@
         </m:r>
       </m:oMath>
       <w:r>
-        <w:t xml:space="preserve">: a naive copy recovered about 95 percent of the retraining gain after small continued-training upgrades and about 40 percent after a large one (mean of five seeds). These facts are used as</w:t>
+        <w:t xml:space="preserve">: for 160M-parameter models a naive copy recovered about 95 percent of the retraining gain after small continued-training upgrades and about 40 percent after a large one, and for 1.4B-parameter models about 99 and 79 percent (means of five seeds). A costly transfer method adds little beyond copy in the larger models. These facts are used as</w:t>
       </w:r>
       <w:r>
         <w:t xml:space="preserve"> </w:t>
@@ -1533,6 +1527,46 @@
             <m:sty m:val="p"/>
           </m:rPr>
           <m:t>≥</m:t>
+        </m:r>
+        <m:r>
+          <m:t>0</m:t>
+        </m:r>
+      </m:oMath>
+      <w:r>
+        <w:t xml:space="preserve">. Running the target without the adapter is always feasible and corresponds to</w:t>
+      </w:r>
+      <w:r>
+        <w:t xml:space="preserve"> </w:t>
+      </w:r>
+      <m:oMath>
+        <m:r>
+          <m:t>R</m:t>
+        </m:r>
+        <m:r>
+          <m:rPr>
+            <m:sty m:val="p"/>
+          </m:rPr>
+          <m:t>=</m:t>
+        </m:r>
+        <m:r>
+          <m:t>0</m:t>
+        </m:r>
+      </m:oMath>
+      <w:r>
+        <w:t xml:space="preserve">, so a method whose measured recovery is negative is treated as</w:t>
+      </w:r>
+      <w:r>
+        <w:t xml:space="preserve"> </w:t>
+      </w:r>
+      <m:oMath>
+        <m:r>
+          <m:t>R</m:t>
+        </m:r>
+        <m:r>
+          <m:rPr>
+            <m:sty m:val="p"/>
+          </m:rPr>
+          <m:t>=</m:t>
         </m:r>
         <m:r>
           <m:t>0</m:t>
@@ -2763,6 +2797,30 @@
       </m:oMath>
       <w:r>
         <w:t xml:space="preserve">.</w:t>
+      </w:r>
+    </w:p>
+    <w:p>
+      <w:pPr>
+        <w:pStyle w:val="BodyText"/>
+      </w:pPr>
+      <w:r>
+        <w:t xml:space="preserve">We repeated the design on five pairs of larger models (1.4B to 3B parameters, five seeds; 4 seeds for the 3B pair; Online Appendix C, Table C.2). Recovery still falls with upgrade size, but much less: copy recovered 0.987 [0.95, 1.03] after the small Pythia-1.4B upgrade and 0.786 [0.72, 0.85] after the large one, against 0.40 for the 160M model. The calibration method improved on copy by at most 0.03 in the Pythia pairs and by 0.01 for Qwen2.5-1.5B, and did not improve on it for Qwen2.5-3B. Base-to-instruct pairs varied widely: copy recovered 0.81 for Qwen2.5-1.5B and 0.65 for Qwen2.5-3B, and for SmolLM2-1.7B copying made the adapter</w:t>
+      </w:r>
+      <w:r>
+        <w:t xml:space="preserve"> </w:t>
+      </w:r>
+      <w:r>
+        <w:rPr>
+          <w:iCs/>
+          <w:i/>
+        </w:rPr>
+        <w:t xml:space="preserve">worse</w:t>
+      </w:r>
+      <w:r>
+        <w:t xml:space="preserve"> </w:t>
+      </w:r>
+      <w:r>
+        <w:t xml:space="preserve">than no adapter (negative recovery), because the instruct model already scores well without one and the retraining gain is small (0.08 nats). The size of the cost-saving room therefore depends on both upgrade size and model scale, and it is small for the larger models in our sample.</w:t>
       </w:r>
     </w:p>
     <w:bookmarkEnd w:id="28"/>
@@ -5090,7 +5148,35 @@
         <w:t xml:space="preserve"> </w:t>
       </w:r>
       <w:r>
-        <w:t xml:space="preserve">is between 0 and 0.12 and no costly method has a market.</w:t>
+        <w:t xml:space="preserve">is between 0 and 0.12 and no costly method has a market. For the larger models,</w:t>
+      </w:r>
+      <w:r>
+        <w:t xml:space="preserve"> </w:t>
+      </w:r>
+      <m:oMath>
+        <m:r>
+          <m:t>Γ</m:t>
+        </m:r>
+      </m:oMath>
+      <w:r>
+        <w:t xml:space="preserve"> </w:t>
+      </w:r>
+      <w:r>
+        <w:t xml:space="preserve">is about 0.07 for Pythia-1.4B after the large upgrade and about 0.04 for Qwen2.5-1.5B, and zero for Qwen2.5-3B and SmolLM2-1.7B; for the small Pythia-1.4B upgrade both methods recover essentially everything and</w:t>
+      </w:r>
+      <w:r>
+        <w:t xml:space="preserve"> </w:t>
+      </w:r>
+      <m:oMath>
+        <m:r>
+          <m:t>Γ</m:t>
+        </m:r>
+      </m:oMath>
+      <w:r>
+        <w:t xml:space="preserve"> </w:t>
+      </w:r>
+      <w:r>
+        <w:t xml:space="preserve">is not informative. With any plausible cost ratio, such as the 0.36 measured for the 160M models, no costly method pays in the larger models: free copy is sufficient, which is the prediction of Proposition 2(a).</w:t>
       </w:r>
     </w:p>
     <w:bookmarkEnd w:id="30"/>
@@ -12342,7 +12428,7 @@
         </m:d>
       </m:oMath>
       <w:r>
-        <w:t xml:space="preserve">. After small upgrades that inequality typically fails because free copy is already close to retraining.</w:t>
+        <w:t xml:space="preserve">. After small upgrades, and in our samples for models of 1B parameters and above, that inequality typically fails because free copy already recovers most of the retraining gain.</w:t>
       </w:r>
     </w:p>
     <w:p>
@@ -12460,7 +12546,7 @@
         </m:r>
       </m:oMath>
       <w:r>
-        <w:t xml:space="preserve">; the owner’s problem is solved in the static limit, with a dynamic-threshold proxy in Section 7.4; the asymmetric compatibility equilibrium is numerical; the switching game is characterized only to first order; the recovery measurements are small-scale (160M to 0.5B parameters, one task, five seeds); and open lines can be discontinued. The first empirical priority is</w:t>
+        <w:t xml:space="preserve">; the owner’s problem is solved in the static limit, with a dynamic-threshold proxy in Section 7.4; the asymmetric compatibility equilibrium is numerical; the switching game is characterized only to first order; the recovery measurements are small-scale (160M to 3B parameters, one task, five seeds, float32 on one GPU); and open lines can be discontinued. The first empirical priority is</w:t>
       </w:r>
       <w:r>
         <w:t xml:space="preserve"> </w:t>
@@ -20188,7 +20274,7 @@
         <w:t xml:space="preserve"> </w:t>
       </w:r>
       <w:r>
-        <w:t xml:space="preserve">in Section 3.3. Models have 160M to 0.5B parameters, one task (GSM8K), and a short training budget (500 training problems, 300 steps). Each pair was run with five seeds (0 to 4) on a single GPU in float32; the seed resamples the training and calibration rows and the training order, and the 200 evaluation rows are fixed. Recovery is</w:t>
+        <w:t xml:space="preserve">in Section 3.3. Table C.1 covers 160M to 0.5B parameters and Table C.2 covers 1.4B to 3B parameters; all pairs use one task (GSM8K), and a short training budget (500 training problems, 300 steps). Each pair was run with five seeds (0 to 4) on a single GPU in float32; the seed resamples the training and calibration rows and the training order, and the 200 evaluation rows are fixed. Recovery is</w:t>
       </w:r>
       <w:r>
         <w:t xml:space="preserve"> </w:t>
@@ -20813,6 +20899,548 @@
       </w:pPr>
       <w:r>
         <w:t xml:space="preserve">The calibration method matches, at each layer, the change in hidden activations that the source adapter produces on unlabeled inputs, with a ridge term that anchors the solution to naive copy. As the ridge diverges the method equals copy. Cost is forward passes plus per-layer linear algebra. Full protocol: public checkpoints from EleutherAI/pythia-160m (steps 73000, 113000, 133000 → 143000), HuggingFaceTB/SmolLM2-360M, and Qwen/Qwen2.5-0.5B; rank-8 LoRA on every linear layer in the decoder; 500 GSM8K training problems; 300 AdamW steps; 128 unlabeled calibration prompts.</w:t>
+      </w:r>
+    </w:p>
+    <w:p>
+      <w:pPr>
+        <w:pStyle w:val="BodyText"/>
+      </w:pPr>
+      <w:r>
+        <w:rPr>
+          <w:bCs/>
+          <w:b/>
+        </w:rPr>
+        <w:t xml:space="preserve">Larger models.</w:t>
+      </w:r>
+      <w:r>
+        <w:t xml:space="preserve"> </w:t>
+      </w:r>
+      <w:r>
+        <w:t xml:space="preserve">Table C.2 repeats the design with 1.4B to 3B parameters, using the same task, hyperparameters, and float32 precision. Seeds run on one GPU; the Qwen2.5-3B pair has four seeds because the fifth was cut off by the time limit of the run.</w:t>
+      </w:r>
+    </w:p>
+    <w:tbl>
+      <w:tblPr>
+        <w:tblStyle w:val="Table"/>
+        <w:tblW w:type="pct" w:w="5000"/>
+        <w:tblLook w:firstRow="1" w:lastRow="0" w:firstColumn="0" w:lastColumn="0" w:noHBand="0" w:noVBand="0" w:val="0020"/>
+        <w:jc w:val="start"/>
+      </w:tblPr>
+      <w:tblGrid>
+        <w:gridCol w:w="1320"/>
+        <w:gridCol w:w="1650"/>
+        <w:gridCol w:w="1650"/>
+        <w:gridCol w:w="1650"/>
+        <w:gridCol w:w="1650"/>
+      </w:tblGrid>
+      <w:tr>
+        <w:trPr>
+          <w:tblHeader w:val="true"/>
+        </w:trPr>
+        <w:tc>
+          <w:tcPr/>
+          <w:p>
+            <w:pPr>
+              <w:pStyle w:val="Compact"/>
+              <w:jc w:val="left"/>
+            </w:pPr>
+            <w:r>
+              <w:t xml:space="preserve">Pair</w:t>
+            </w:r>
+          </w:p>
+        </w:tc>
+        <w:tc>
+          <w:tcPr/>
+          <w:p>
+            <w:pPr>
+              <w:pStyle w:val="Compact"/>
+              <w:jc w:val="center"/>
+            </w:pPr>
+            <m:oMath>
+              <m:sSub>
+                <m:e>
+                  <m:r>
+                    <m:t>R</m:t>
+                  </m:r>
+                </m:e>
+                <m:sub>
+                  <m:r>
+                    <m:t>C</m:t>
+                  </m:r>
+                </m:sub>
+              </m:sSub>
+            </m:oMath>
+            <w:r>
+              <w:t xml:space="preserve"> </w:t>
+            </w:r>
+            <w:r>
+              <w:t xml:space="preserve">mean [95% CI]</w:t>
+            </w:r>
+          </w:p>
+        </w:tc>
+        <w:tc>
+          <w:tcPr/>
+          <w:p>
+            <w:pPr>
+              <w:pStyle w:val="Compact"/>
+              <w:jc w:val="center"/>
+            </w:pPr>
+            <m:oMath>
+              <m:sSub>
+                <m:e>
+                  <m:r>
+                    <m:t>R</m:t>
+                  </m:r>
+                </m:e>
+                <m:sub>
+                  <m:r>
+                    <m:t>A</m:t>
+                  </m:r>
+                </m:sub>
+              </m:sSub>
+            </m:oMath>
+            <w:r>
+              <w:t xml:space="preserve"> </w:t>
+            </w:r>
+            <w:r>
+              <w:t xml:space="preserve">mean [95% CI]</w:t>
+            </w:r>
+          </w:p>
+        </w:tc>
+        <w:tc>
+          <w:tcPr/>
+          <w:p>
+            <w:pPr>
+              <w:pStyle w:val="Compact"/>
+              <w:jc w:val="center"/>
+            </w:pPr>
+            <w:r>
+              <w:t xml:space="preserve">Seeds with</w:t>
+            </w:r>
+            <w:r>
+              <w:t xml:space="preserve"> </w:t>
+            </w:r>
+            <m:oMath>
+              <m:sSub>
+                <m:e>
+                  <m:r>
+                    <m:t>R</m:t>
+                  </m:r>
+                </m:e>
+                <m:sub>
+                  <m:r>
+                    <m:t>A</m:t>
+                  </m:r>
+                </m:sub>
+              </m:sSub>
+              <m:r>
+                <m:rPr>
+                  <m:sty m:val="p"/>
+                </m:rPr>
+                <m:t>&gt;</m:t>
+              </m:r>
+              <m:sSub>
+                <m:e>
+                  <m:r>
+                    <m:t>R</m:t>
+                  </m:r>
+                </m:e>
+                <m:sub>
+                  <m:r>
+                    <m:t>C</m:t>
+                  </m:r>
+                </m:sub>
+              </m:sSub>
+            </m:oMath>
+          </w:p>
+        </w:tc>
+        <w:tc>
+          <w:tcPr/>
+          <w:p>
+            <w:pPr>
+              <w:pStyle w:val="Compact"/>
+              <w:jc w:val="center"/>
+            </w:pPr>
+            <w:r>
+              <w:t xml:space="preserve">NLL: none / retrain</w:t>
+            </w:r>
+          </w:p>
+        </w:tc>
+      </w:tr>
+      <w:tr>
+        <w:tc>
+          <w:tcPr/>
+          <w:p>
+            <w:pPr>
+              <w:pStyle w:val="Compact"/>
+              <w:jc w:val="left"/>
+            </w:pPr>
+            <w:r>
+              <w:t xml:space="preserve">Pythia-1.4B, +10k steps</w:t>
+            </w:r>
+          </w:p>
+        </w:tc>
+        <w:tc>
+          <w:tcPr/>
+          <w:p>
+            <w:pPr>
+              <w:pStyle w:val="Compact"/>
+              <w:jc w:val="center"/>
+            </w:pPr>
+            <w:r>
+              <w:t xml:space="preserve">0.987 [0.947, 1.028]</w:t>
+            </w:r>
+          </w:p>
+        </w:tc>
+        <w:tc>
+          <w:tcPr/>
+          <w:p>
+            <w:pPr>
+              <w:pStyle w:val="Compact"/>
+              <w:jc w:val="center"/>
+            </w:pPr>
+            <w:r>
+              <w:t xml:space="preserve">0.991 [0.952, 1.030]</w:t>
+            </w:r>
+          </w:p>
+        </w:tc>
+        <w:tc>
+          <w:tcPr/>
+          <w:p>
+            <w:pPr>
+              <w:pStyle w:val="Compact"/>
+              <w:jc w:val="center"/>
+            </w:pPr>
+            <w:r>
+              <w:t xml:space="preserve">5 of 5</w:t>
+            </w:r>
+          </w:p>
+        </w:tc>
+        <w:tc>
+          <w:tcPr/>
+          <w:p>
+            <w:pPr>
+              <w:pStyle w:val="Compact"/>
+              <w:jc w:val="center"/>
+            </w:pPr>
+            <w:r>
+              <w:t xml:space="preserve">2.06 / 0.99 to 1.02</w:t>
+            </w:r>
+          </w:p>
+        </w:tc>
+      </w:tr>
+      <w:tr>
+        <w:tc>
+          <w:tcPr/>
+          <w:p>
+            <w:pPr>
+              <w:pStyle w:val="Compact"/>
+              <w:jc w:val="left"/>
+            </w:pPr>
+            <w:r>
+              <w:t xml:space="preserve">Pythia-1.4B, +70k steps</w:t>
+            </w:r>
+          </w:p>
+        </w:tc>
+        <w:tc>
+          <w:tcPr/>
+          <w:p>
+            <w:pPr>
+              <w:pStyle w:val="Compact"/>
+              <w:jc w:val="center"/>
+            </w:pPr>
+            <w:r>
+              <w:t xml:space="preserve">0.786 [0.722, 0.850]</w:t>
+            </w:r>
+          </w:p>
+        </w:tc>
+        <w:tc>
+          <w:tcPr/>
+          <w:p>
+            <w:pPr>
+              <w:pStyle w:val="Compact"/>
+              <w:jc w:val="center"/>
+            </w:pPr>
+            <w:r>
+              <w:t xml:space="preserve">0.809 [0.754, 0.863]</w:t>
+            </w:r>
+          </w:p>
+        </w:tc>
+        <w:tc>
+          <w:tcPr/>
+          <w:p>
+            <w:pPr>
+              <w:pStyle w:val="Compact"/>
+              <w:jc w:val="center"/>
+            </w:pPr>
+            <w:r>
+              <w:t xml:space="preserve">5 of 5</w:t>
+            </w:r>
+          </w:p>
+        </w:tc>
+        <w:tc>
+          <w:tcPr/>
+          <w:p>
+            <w:pPr>
+              <w:pStyle w:val="Compact"/>
+              <w:jc w:val="center"/>
+            </w:pPr>
+            <w:r>
+              <w:t xml:space="preserve">2.06 / 0.97 to 1.03</w:t>
+            </w:r>
+          </w:p>
+        </w:tc>
+      </w:tr>
+      <w:tr>
+        <w:tc>
+          <w:tcPr/>
+          <w:p>
+            <w:pPr>
+              <w:pStyle w:val="Compact"/>
+              <w:jc w:val="left"/>
+            </w:pPr>
+            <w:r>
+              <w:t xml:space="preserve">Qwen2.5-1.5B, Base → Instruct</w:t>
+            </w:r>
+          </w:p>
+        </w:tc>
+        <w:tc>
+          <w:tcPr/>
+          <w:p>
+            <w:pPr>
+              <w:pStyle w:val="Compact"/>
+              <w:jc w:val="center"/>
+            </w:pPr>
+            <w:r>
+              <w:t xml:space="preserve">0.810 [0.584, 1.036]</w:t>
+            </w:r>
+          </w:p>
+        </w:tc>
+        <w:tc>
+          <w:tcPr/>
+          <w:p>
+            <w:pPr>
+              <w:pStyle w:val="Compact"/>
+              <w:jc w:val="center"/>
+            </w:pPr>
+            <w:r>
+              <w:t xml:space="preserve">0.822 [0.590, 1.055]</w:t>
+            </w:r>
+          </w:p>
+        </w:tc>
+        <w:tc>
+          <w:tcPr/>
+          <w:p>
+            <w:pPr>
+              <w:pStyle w:val="Compact"/>
+              <w:jc w:val="center"/>
+            </w:pPr>
+            <w:r>
+              <w:t xml:space="preserve">5 of 5</w:t>
+            </w:r>
+          </w:p>
+        </w:tc>
+        <w:tc>
+          <w:tcPr/>
+          <w:p>
+            <w:pPr>
+              <w:pStyle w:val="Compact"/>
+              <w:jc w:val="center"/>
+            </w:pPr>
+            <w:r>
+              <w:t xml:space="preserve">0.87 / 0.58 to 0.64</w:t>
+            </w:r>
+          </w:p>
+        </w:tc>
+      </w:tr>
+      <w:tr>
+        <w:tc>
+          <w:tcPr/>
+          <w:p>
+            <w:pPr>
+              <w:pStyle w:val="Compact"/>
+              <w:jc w:val="left"/>
+            </w:pPr>
+            <w:r>
+              <w:t xml:space="preserve">Qwen2.5-3B, Base → Instruct (4 seeds)</w:t>
+            </w:r>
+          </w:p>
+        </w:tc>
+        <w:tc>
+          <w:tcPr/>
+          <w:p>
+            <w:pPr>
+              <w:pStyle w:val="Compact"/>
+              <w:jc w:val="center"/>
+            </w:pPr>
+            <w:r>
+              <w:t xml:space="preserve">0.645 [0.396, 0.895]</w:t>
+            </w:r>
+          </w:p>
+        </w:tc>
+        <w:tc>
+          <w:tcPr/>
+          <w:p>
+            <w:pPr>
+              <w:pStyle w:val="Compact"/>
+              <w:jc w:val="center"/>
+            </w:pPr>
+            <w:r>
+              <w:t xml:space="preserve">0.625 [0.362, 0.888]</w:t>
+            </w:r>
+          </w:p>
+        </w:tc>
+        <w:tc>
+          <w:tcPr/>
+          <w:p>
+            <w:pPr>
+              <w:pStyle w:val="Compact"/>
+              <w:jc w:val="center"/>
+            </w:pPr>
+            <w:r>
+              <w:t xml:space="preserve">0 of 4</w:t>
+            </w:r>
+          </w:p>
+        </w:tc>
+        <w:tc>
+          <w:tcPr/>
+          <w:p>
+            <w:pPr>
+              <w:pStyle w:val="Compact"/>
+              <w:jc w:val="center"/>
+            </w:pPr>
+            <w:r>
+              <w:t xml:space="preserve">1.20 / 0.63 to 0.66</w:t>
+            </w:r>
+          </w:p>
+        </w:tc>
+      </w:tr>
+      <w:tr>
+        <w:tc>
+          <w:tcPr/>
+          <w:p>
+            <w:pPr>
+              <w:pStyle w:val="Compact"/>
+              <w:jc w:val="left"/>
+            </w:pPr>
+            <w:r>
+              <w:t xml:space="preserve">SmolLM2-1.7B, Base → Instruct</w:t>
+            </w:r>
+          </w:p>
+        </w:tc>
+        <w:tc>
+          <w:tcPr/>
+          <w:p>
+            <w:pPr>
+              <w:pStyle w:val="Compact"/>
+              <w:jc w:val="center"/>
+            </w:pPr>
+            <w:r>
+              <w:t xml:space="preserve">−1.316 [−1.787, −0.846]</w:t>
+            </w:r>
+          </w:p>
+        </w:tc>
+        <w:tc>
+          <w:tcPr/>
+          <w:p>
+            <w:pPr>
+              <w:pStyle w:val="Compact"/>
+              <w:jc w:val="center"/>
+            </w:pPr>
+            <w:r>
+              <w:t xml:space="preserve">−1.449 [−1.987, −0.911]</w:t>
+            </w:r>
+          </w:p>
+        </w:tc>
+        <w:tc>
+          <w:tcPr/>
+          <w:p>
+            <w:pPr>
+              <w:pStyle w:val="Compact"/>
+              <w:jc w:val="center"/>
+            </w:pPr>
+            <w:r>
+              <w:t xml:space="preserve">0 of 5</w:t>
+            </w:r>
+          </w:p>
+        </w:tc>
+        <w:tc>
+          <w:tcPr/>
+          <w:p>
+            <w:pPr>
+              <w:pStyle w:val="Compact"/>
+              <w:jc w:val="center"/>
+            </w:pPr>
+            <w:r>
+              <w:t xml:space="preserve">0.68 / 0.59 to 0.61</w:t>
+            </w:r>
+          </w:p>
+        </w:tc>
+      </w:tr>
+    </w:tbl>
+    <w:p>
+      <w:pPr>
+        <w:pStyle w:val="BodyText"/>
+      </w:pPr>
+      <w:r>
+        <w:rPr>
+          <w:iCs/>
+          <w:i/>
+        </w:rPr>
+        <w:t xml:space="preserve">Table C.2. Recovery rates over five seeds on larger model pairs.</w:t>
+      </w:r>
+      <w:r>
+        <w:t xml:space="preserve"> </w:t>
+      </w:r>
+      <w:r>
+        <w:t xml:space="preserve">Recovery above one is sampling noise around full recovery. For SmolLM2-1.7B the copied adapter has higher held-out loss (about 0.77) than the target without any adapter (0.677), and the retraining gain is only about 0.08, so the ratio is large and negative; in the model this pair has</w:t>
+      </w:r>
+      <w:r>
+        <w:t xml:space="preserve"> </w:t>
+      </w:r>
+      <m:oMath>
+        <m:sSub>
+          <m:e>
+            <m:r>
+              <m:t>R</m:t>
+            </m:r>
+          </m:e>
+          <m:sub>
+            <m:r>
+              <m:t>C</m:t>
+            </m:r>
+          </m:sub>
+        </m:sSub>
+        <m:r>
+          <m:rPr>
+            <m:sty m:val="p"/>
+          </m:rPr>
+          <m:t>=</m:t>
+        </m:r>
+        <m:sSub>
+          <m:e>
+            <m:r>
+              <m:t>R</m:t>
+            </m:r>
+          </m:e>
+          <m:sub>
+            <m:r>
+              <m:t>A</m:t>
+            </m:r>
+          </m:sub>
+        </m:sSub>
+        <m:r>
+          <m:rPr>
+            <m:sty m:val="p"/>
+          </m:rPr>
+          <m:t>=</m:t>
+        </m:r>
+        <m:r>
+          <m:t>0</m:t>
+        </m:r>
+      </m:oMath>
+      <w:r>
+        <w:t xml:space="preserve">. The wall-clock cost ratios of these runs are not reported because on a GPU they are dominated by fixed overhead; a CPU measurement at this scale was not run.</w:t>
       </w:r>
     </w:p>
     <w:bookmarkEnd w:id="59"/>

</xml_diff>

<commit_message>
Reframe practical message: default to free copy
Co-Authored-By: Claude Sonnet 5.5 <noreply@anthropic.com>
Claude-Session: https://claude.ai/code/session_015MZUD2t4mu2jrXpfMooaCG
</commit_message>
<xml_diff>
--- a/paper/isr_manuscript.docx
+++ b/paper/isr_manuscript.docx
@@ -206,7 +206,18 @@
         </m:r>
       </m:oMath>
       <w:r>
-        <w:t xml:space="preserve">. We then let the platform owner choose how often to release. An owner that captures part of enterprise surplus over-releases if and only if the average customer is harmed at the margin by a faster clock. Compatibility tools and release speed are strategic complements for any distribution of asset values, so better tools invite faster release and can leave firms that retrain anyway worse off. Under logit duopoly with a release race, each owner internalizes exactly one-third of the marginal change in customer surplus, and, in numerical analysis, an intermediate race separates owners into a fast, compatible frontier platform and a slow, stable one. Release histories of six open-weight model families imply about two main-line versions per year, and recovery measured on ten open model pairs (160M to 3B parameters) falls with upgrade size, while the room for a costly transfer method shrinks as models grow. The results recast compatibility tooling as a governance variable that the platform owner sets jointly with the pace of change.</w:t>
+        <w:t xml:space="preserve">. We then let the platform owner choose how often to release. An owner that captures part of enterprise surplus over-releases if and only if the average customer is harmed at the margin by a faster clock. Compatibility tools and release speed are strategic complements for any distribution of asset values, so better tools invite faster release and can leave firms that retrain anyway worse off. Under logit duopoly with a release race, each owner internalizes exactly one-third of the marginal change in customer surplus, and, in numerical analysis, an intermediate race separates owners into a fast, compatible frontier platform and a slow, stable one. Release histories of six open-weight model families imply about two main-line versions per year, and recovery measured on ten open model pairs (160M to 3B parameters) falls with upgrade size, while the room for a costly transfer method shrinks as models grow. The practical rule that follows is simple: copy by default, buy a transfer tool only when its measured cost is below</w:t>
+      </w:r>
+      <w:r>
+        <w:t xml:space="preserve"> </w:t>
+      </w:r>
+      <m:oMath>
+        <m:r>
+          <m:t>Γ</m:t>
+        </m:r>
+      </m:oMath>
+      <w:r>
+        <w:t xml:space="preserve">, and read the arrival of owner-provided compatibility tooling as a signal of faster release. The results recast compatibility tooling as a governance variable that the platform owner sets jointly with the pace of change.</w:t>
       </w:r>
     </w:p>
     <w:bookmarkEnd w:id="20"/>
@@ -461,7 +472,7 @@
               <w:jc w:val="left"/>
             </w:pPr>
             <w:r>
-              <w:t xml:space="preserve">Triage assets by value relative to retraining cost; do not retrain by default</w:t>
+              <w:t xml:space="preserve">Copy first; do not retrain by default, and triage assets by value relative to retraining cost</w:t>
             </w:r>
           </w:p>
         </w:tc>
@@ -513,28 +524,16 @@
               <w:jc w:val="left"/>
             </w:pPr>
             <w:r>
-              <w:t xml:space="preserve">Buy compatibility tools by measured</w:t>
+              <w:t xml:space="preserve">Default to free copy; buy a compatibility tool only if its measured cost is below</w:t>
             </w:r>
             <w:r>
               <w:t xml:space="preserve"> </w:t>
             </w:r>
             <m:oMath>
-              <m:r>
-                <m:t>C</m:t>
-              </m:r>
-              <m:r>
-                <m:rPr>
-                  <m:sty m:val="p"/>
-                </m:rPr>
-                <m:t>&lt;</m:t>
-              </m:r>
               <m:r>
                 <m:t>Γ</m:t>
               </m:r>
             </m:oMath>
-            <w:r>
-              <w:t xml:space="preserve">, not by vendor claims</w:t>
-            </w:r>
           </w:p>
         </w:tc>
       </w:tr>
@@ -753,6 +752,51 @@
           <w:i/>
         </w:rPr>
         <w:t xml:space="preserve">Table 1. Summary of results.</w:t>
+      </w:r>
+    </w:p>
+    <w:p>
+      <w:pPr>
+        <w:pStyle w:val="BodyText"/>
+      </w:pPr>
+      <w:r>
+        <w:rPr>
+          <w:bCs/>
+          <w:b/>
+        </w:rPr>
+        <w:t xml:space="preserve">The practical message.</w:t>
+      </w:r>
+      <w:r>
+        <w:t xml:space="preserve"> </w:t>
+      </w:r>
+      <w:r>
+        <w:t xml:space="preserve">The model’s central prescription is a default:</w:t>
+      </w:r>
+      <w:r>
+        <w:t xml:space="preserve"> </w:t>
+      </w:r>
+      <w:r>
+        <w:rPr>
+          <w:iCs/>
+          <w:i/>
+        </w:rPr>
+        <w:t xml:space="preserve">when free copy recovers most of the value, copy.</w:t>
+      </w:r>
+      <w:r>
+        <w:t xml:space="preserve"> </w:t>
+      </w:r>
+      <w:r>
+        <w:t xml:space="preserve">Retraining is warranted only for assets whose value exceeds a threshold that is high relative to the NPV rule, and a costly transfer tool pays only in a bounded intermediate band and only if its cost is below</w:t>
+      </w:r>
+      <w:r>
+        <w:t xml:space="preserve"> </w:t>
+      </w:r>
+      <m:oMath>
+        <m:r>
+          <m:t>Γ</m:t>
+        </m:r>
+      </m:oMath>
+      <w:r>
+        <w:t xml:space="preserve">. Our measurements fit this default. In nine of the ten open model pairs we tested, free copy leaves too little to gain for any costly method with a plausible cost to be worthwhile; the exception is a large upgrade of a small model, where copy recovered only 40 percent of the retraining gain. The paper therefore argues against two habits that look prudent: retraining at every upgrade, and buying compatibility tools by default.</w:t>
       </w:r>
     </w:p>
     <w:p>
@@ -880,7 +924,7 @@
         <w:t xml:space="preserve"> </w:t>
       </w:r>
       <w:r>
-        <w:t xml:space="preserve">of complementary assets, and it characterizes the resulting policy regions without reference to any named algorithm. Second, it treats the platform owner as the agent that sets the rate at which the adopter’s options are destroyed, and it identifies a complementarity between compatibility support and release speed with a sharp distributional implication: tools that help some customers hurt others through the cadence they induce. This extends platform-evolution research (Tiwana et al. 2010) with an explicit maintenance channel. Third, it shows how much of the change in customer surplus competing owners internalize and that the speed–compatibility bundle is a dimension along which platforms can separate, which links platform governance to platform competition (Parker and Van Alstyne 2018, Rochet and Tirole 2003). The paper also offers managers a maintenance policy whose qualitative regions do not depend on any named algorithm.</w:t>
+        <w:t xml:space="preserve">of complementary assets, and it characterizes the resulting policy regions without reference to any named algorithm. Second, it treats the platform owner as the agent that sets the rate at which the adopter’s options are destroyed, and it identifies a complementarity between compatibility support and release speed with a sharp distributional implication: tools that help some customers hurt others through the cadence they induce. This extends platform-evolution research (Tiwana et al. 2010) with an explicit maintenance channel. Third, it shows how much of the change in customer surplus competing owners internalize and that the speed–compatibility bundle is a dimension along which platforms can separate, which links platform governance to platform competition (Parker and Van Alstyne 2018, Rochet and Tirole 2003). The paper also offers managers a maintenance policy whose qualitative regions do not depend on any named algorithm and whose default is free copy.</w:t>
       </w:r>
     </w:p>
     <w:p>
@@ -2820,7 +2864,7 @@
         <w:t xml:space="preserve"> </w:t>
       </w:r>
       <w:r>
-        <w:t xml:space="preserve">than no adapter (negative recovery), because the instruct model already scores well without one and the retraining gain is small (0.08 nats). The size of the cost-saving room therefore depends on both upgrade size and model scale, and it is small for the larger models in our sample.</w:t>
+        <w:t xml:space="preserve">than no adapter (negative recovery), because the instruct model already scores well without one and the retraining gain is small (0.08 nats). The size of the cost-saving room therefore depends on both upgrade size and model scale, and it is small for the larger models in our sample. That is the regime in which the model recommends free copy.</w:t>
       </w:r>
     </w:p>
     <w:bookmarkEnd w:id="28"/>
@@ -12282,6 +12326,22 @@
         <w:pStyle w:val="FirstParagraph"/>
       </w:pPr>
       <w:r>
+        <w:t xml:space="preserve">The model’s main practical prescription is a default:</w:t>
+      </w:r>
+      <w:r>
+        <w:t xml:space="preserve"> </w:t>
+      </w:r>
+      <w:r>
+        <w:rPr>
+          <w:bCs/>
+          <w:b/>
+        </w:rPr>
+        <w:t xml:space="preserve">when free copy recovers most of the value, copy.</w:t>
+      </w:r>
+      <w:r>
+        <w:t xml:space="preserve"> </w:t>
+      </w:r>
+      <w:r>
         <w:t xml:space="preserve">Five implications do not depend on a named transfer algorithm.</w:t>
       </w:r>
     </w:p>
@@ -12298,27 +12358,13 @@
           <w:bCs/>
           <w:b/>
         </w:rPr>
-        <w:t xml:space="preserve">Triage by value.</w:t>
-      </w:r>
-      <w:r>
-        <w:t xml:space="preserve"> </w:t>
-      </w:r>
-      <w:r>
-        <w:t xml:space="preserve">Triage complementary assets by value relative to retraining cost, and let the platform’s estimated</w:t>
-      </w:r>
-      <w:r>
-        <w:t xml:space="preserve"> </w:t>
-      </w:r>
-      <m:oMath>
-        <m:r>
-          <m:t>μ</m:t>
-        </m:r>
-      </m:oMath>
-      <w:r>
-        <w:t xml:space="preserve"> </w:t>
-      </w:r>
-      <w:r>
-        <w:t xml:space="preserve">set the boundaries. Copy below a low cutoff, consider a costly transfer tool in the middle, retrain only above a high cutoff.</w:t>
+        <w:t xml:space="preserve">Default to free copy.</w:t>
+      </w:r>
+      <w:r>
+        <w:t xml:space="preserve"> </w:t>
+      </w:r>
+      <w:r>
+        <w:t xml:space="preserve">Reuse the existing adapter on the new base model first. Proposition 2(a) shows that this weakly dominates retraining immediately for every asset value, because the right to retrain later is kept. In our measurements copy recovered 92 to 99 percent of the retraining gain after small upgrades and 65 to 81 percent for three of the four larger pairs, leaving little for any costly method to add. Compare the copied adapter with running the new model without one: for SmolLM2-1.7B the copy was worse than no adapter, in which case the right default is the base model, not the copy.</w:t>
       </w:r>
     </w:p>
     <w:p>
@@ -12334,7 +12380,66 @@
           <w:bCs/>
           <w:b/>
         </w:rPr>
-        <w:t xml:space="preserve">Buy tools against</w:t>
+        <w:t xml:space="preserve">Retrain only above the threshold, and not at every upgrade.</w:t>
+      </w:r>
+      <w:r>
+        <w:t xml:space="preserve"> </w:t>
+      </w:r>
+      <w:r>
+        <w:t xml:space="preserve">Retraining is optimal only for assets whose value exceeds</w:t>
+      </w:r>
+      <w:r>
+        <w:t xml:space="preserve"> </w:t>
+      </w:r>
+      <m:oMath>
+        <m:sSup>
+          <m:e>
+            <m:r>
+              <m:t>v</m:t>
+            </m:r>
+          </m:e>
+          <m:sup>
+            <m:r>
+              <m:rPr>
+                <m:sty m:val="p"/>
+              </m:rPr>
+              <m:t>*</m:t>
+            </m:r>
+          </m:sup>
+        </m:sSup>
+      </m:oMath>
+      <w:r>
+        <w:t xml:space="preserve">, which is higher than the NPV threshold and rises with upgrade intensity and volatility (Proposition 1). Triage the portfolio by value relative to retraining cost, and let the platform’s estimated</w:t>
+      </w:r>
+      <w:r>
+        <w:t xml:space="preserve"> </w:t>
+      </w:r>
+      <m:oMath>
+        <m:r>
+          <m:t>μ</m:t>
+        </m:r>
+      </m:oMath>
+      <w:r>
+        <w:t xml:space="preserve"> </w:t>
+      </w:r>
+      <w:r>
+        <w:t xml:space="preserve">set the boundaries: copy below a high cutoff, retrain above it.</w:t>
+      </w:r>
+    </w:p>
+    <w:p>
+      <w:pPr>
+        <w:numPr>
+          <w:ilvl w:val="0"/>
+          <w:numId w:val="1001"/>
+        </w:numPr>
+        <w:pStyle w:val="Compact"/>
+      </w:pPr>
+      <w:r>
+        <w:rPr>
+          <w:bCs/>
+          <w:b/>
+        </w:rPr>
+        <w:t xml:space="preserve">Buy transfer tools only against a measured</w:t>
       </w:r>
       <w:r>
         <w:rPr>
@@ -12359,7 +12464,7 @@
         <w:t xml:space="preserve"> </w:t>
       </w:r>
       <w:r>
-        <w:t xml:space="preserve">Buy transfer tools when measured</w:t>
+        <w:t xml:space="preserve">A costly tool can pay only in an intermediate band, and only when measured</w:t>
       </w:r>
       <w:r>
         <w:t xml:space="preserve"> </w:t>
@@ -12428,7 +12533,7 @@
         </m:d>
       </m:oMath>
       <w:r>
-        <w:t xml:space="preserve">. After small upgrades, and in our samples for models of 1B parameters and above, that inequality typically fails because free copy already recovers most of the retraining gain.</w:t>
+        <w:t xml:space="preserve">. That inequality failed in nine of the ten pairs we tested (for the four larger pairs, against the cost ratio of 0.36 measured on the smaller models, since we did not measure CPU costs at that scale). It held only for a large upgrade of a 160M-parameter model, where copy recovered 40 percent. Test copy first on a sample of adapters; if it already recovers most of the gain, do not buy.</w:t>
       </w:r>
     </w:p>
     <w:p>
@@ -12450,7 +12555,7 @@
         <w:t xml:space="preserve"> </w:t>
       </w:r>
       <w:r>
-        <w:t xml:space="preserve">Owner-provided migration tools should be expected to arrive with faster releases. Owners of the highest-value assets, who retrain anyway, can be made worse off by those tools. For those assets, a contractual cap on release frequency or a long-term-support line can be worth more than a better converter.</w:t>
+        <w:t xml:space="preserve">Owner-provided migration tools should be expected to arrive with faster releases (Proposition 4a). Owners of the highest-value assets, who retrain anyway, can be made worse off by those tools. For those assets, a contractual cap on release frequency or a long-term-support line can be worth more than a better converter.</w:t>
       </w:r>
     </w:p>
     <w:p>
@@ -12466,35 +12571,13 @@
           <w:bCs/>
           <w:b/>
         </w:rPr>
-        <w:t xml:space="preserve">Segment across platforms.</w:t>
-      </w:r>
-      <w:r>
-        <w:t xml:space="preserve"> </w:t>
-      </w:r>
-      <w:r>
-        <w:t xml:space="preserve">If owners separate into frontier and stable platforms, park high-value and regulated adapters on the stable line and mid-value adapters on the frontier line.</w:t>
-      </w:r>
-    </w:p>
-    <w:p>
-      <w:pPr>
-        <w:numPr>
-          <w:ilvl w:val="0"/>
-          <w:numId w:val="1001"/>
-        </w:numPr>
-        <w:pStyle w:val="Compact"/>
-      </w:pPr>
-      <w:r>
-        <w:rPr>
-          <w:bCs/>
-          <w:b/>
-        </w:rPr>
-        <w:t xml:space="preserve">Time retraining.</w:t>
-      </w:r>
-      <w:r>
-        <w:t xml:space="preserve"> </w:t>
-      </w:r>
-      <w:r>
-        <w:t xml:space="preserve">When the next dated release is near, defer retraining of adapters that sit close to</w:t>
+        <w:t xml:space="preserve">Segment and time.</w:t>
+      </w:r>
+      <w:r>
+        <w:t xml:space="preserve"> </w:t>
+      </w:r>
+      <w:r>
+        <w:t xml:space="preserve">If owners separate into frontier and stable platforms, park high-value and regulated adapters on the stable line and mid-value adapters on the frontier line. When the next dated release is near, defer retraining of adapters that sit close to</w:t>
       </w:r>
       <w:r>
         <w:t xml:space="preserve"> </w:t>
@@ -12598,7 +12681,7 @@
         <w:pStyle w:val="FirstParagraph"/>
       </w:pPr>
       <w:r>
-        <w:t xml:space="preserve">The paper’s theoretical claim is not that any particular converter is optimal. It is that complementary assets on an evolving platform create a maintenance option; that a free partial transfer already knocks out blanket retraining; that a costly converter has a market only in a bounded intermediate band; and that the platform owner, facing that band, will use improvements in the converter to go faster. Competing owners internalize a fixed fraction of the resulting change in customer surplus; in the logit workhorse the fraction is one-third. Platforms are not only bundles of options for adopters (Fichman 2004). They are also the agents that choose how fast those options expire.</w:t>
+        <w:t xml:space="preserve">The paper’s practical message is a default, free copy, and its theoretical claim is not that any particular converter is optimal. It is that complementary assets on an evolving platform create a maintenance option; that a free partial transfer already knocks out blanket retraining; that a costly converter has a market only in a bounded intermediate band; and that the platform owner, facing that band, will use improvements in the converter to go faster. Competing owners internalize a fixed fraction of the resulting change in customer surplus; in the logit workhorse the fraction is one-third. Platforms are not only bundles of options for adopters (Fichman 2004). They are also the agents that choose how fast those options expire.</w:t>
       </w:r>
     </w:p>
     <w:bookmarkEnd w:id="55"/>

</xml_diff>

<commit_message>
Add summarization and text-to-SQL tasks, combine into 24-cell analysis, update manuscript
Co-Authored-By: Claude Sonnet 5.5 <noreply@anthropic.com>
Claude-Session: https://claude.ai/code/session_015MZUD2t4mu2jrXpfMooaCG
</commit_message>
<xml_diff>
--- a/paper/isr_manuscript.docx
+++ b/paper/isr_manuscript.docx
@@ -206,7 +206,7 @@
         </m:r>
       </m:oMath>
       <w:r>
-        <w:t xml:space="preserve">. We then let the platform owner choose how often to release. An owner that captures part of enterprise surplus over-releases if and only if the average customer is harmed at the margin by a faster clock. Compatibility tools and release speed are strategic complements for any distribution of asset values, so better tools invite faster release and can leave firms that retrain anyway worse off. Under logit duopoly with a release race, each owner internalizes exactly one-third of the marginal change in customer surplus, and, in numerical analysis, an intermediate race separates owners into a fast, compatible frontier platform and a slow, stable one. Release histories of six open-weight model families imply about two main-line versions per year, and recovery measured on ten open model pairs (160M to 3B parameters) falls with upgrade size, while the room for a costly transfer method shrinks as models grow. The practical rule that follows is simple: copy by default, buy a transfer tool only when its measured cost is below</w:t>
+        <w:t xml:space="preserve">. We then let the platform owner choose how often to release. An owner that captures part of enterprise surplus over-releases if and only if the average customer is harmed at the margin by a faster clock. Compatibility tools and release speed are strategic complements for any distribution of asset values, so better tools invite faster release and can leave firms that retrain anyway worse off. Under logit duopoly with a release race, each owner internalizes exactly one-third of the marginal change in customer surplus, and, in numerical analysis, an intermediate race separates owners into a fast, compatible frontier platform and a slow, stable one. Release histories of six open-weight model families imply about two main-line versions per year, and recovery measured on open model pairs (160M to 3B parameters) on three tasks falls with upgrade size, with room for a costly transfer method in only two of 24 pair-task combinations. The practical rule that follows is simple: copy by default, buy a transfer tool only when its measured cost is below</w:t>
       </w:r>
       <w:r>
         <w:t xml:space="preserve"> </w:t>
@@ -796,7 +796,7 @@
         </m:r>
       </m:oMath>
       <w:r>
-        <w:t xml:space="preserve">. Our measurements fit this default. In nine of the ten open model pairs we tested, free copy leaves too little to gain for any costly method with a plausible cost to be worthwhile; the exception is a large upgrade of a small model, where copy recovered only 40 percent of the retraining gain. The paper therefore argues against two habits that look prudent: retraining at every upgrade, and buying compatibility tools by default.</w:t>
+        <w:t xml:space="preserve">. Our measurements fit this default. In 22 of the 24 pair-task combinations we tested, free copy leaves too little to gain for any costly method with a plausible cost to be worthwhile; the exceptions are large upgrades of a 160M-parameter model on two tasks, where copy recovered 40 and 67 percent of the retraining gain (a third task is borderline). Where copy recovers little and no tool helps, as for summarization with instruction-tuned targets, the model says to retrain. The default is therefore a first step that must be checked on a sample, not an unconditional rule. The paper therefore argues against two habits that look prudent: retraining at every upgrade, and buying compatibility tools by default.</w:t>
       </w:r>
     </w:p>
     <w:p>
@@ -804,7 +804,7 @@
         <w:pStyle w:val="BodyText"/>
       </w:pPr>
       <w:r>
-        <w:t xml:space="preserve">Two empirical inputs discipline the model; they are not the contribution. Public release dates for Llama, Gemma, Phi, Qwen, Mistral, and DeepSeek through 28 September 2026 imply a pooled primary-definition intensity of 1.97 main-line versions per year. Recovery rates measured on ten open model pairs show that upgrade size, not the brand of transfer method, is the first-order determinant of</w:t>
+        <w:t xml:space="preserve">Two empirical inputs discipline the model; they are not the contribution. Public release dates for Llama, Gemma, Phi, Qwen, Mistral, and DeepSeek through 28 September 2026 imply a pooled primary-definition intensity of 1.97 main-line versions per year. Recovery rates measured on open model pairs, on math reasoning, summarization, and text-to-SQL, show that upgrade size and the task, not the brand of transfer method, are the first-order determinants of</w:t>
       </w:r>
       <w:r>
         <w:t xml:space="preserve"> </w:t>
@@ -815,7 +815,7 @@
         </m:r>
       </m:oMath>
       <w:r>
-        <w:t xml:space="preserve">: for 160M-parameter models a naive copy recovered about 95 percent of the retraining gain after small continued-training upgrades and about 40 percent after a large one, and for 1.4B-parameter models about 99 and 79 percent (means of five seeds). A costly transfer method adds little beyond copy in the larger models. These facts are used as</w:t>
+        <w:t xml:space="preserve">. After small continued-training upgrades of a 160M-parameter model a naive copy recovered 91 to 97 percent of the retraining gain on all three tasks. After a large upgrade it recovered 35 to 67 percent, depending on the task. In the larger models copy recovered 79 to 99 percent after the large upgrade on two tasks and only 12 percent on summarization, and a costly transfer method added little beyond copy except on summarization (means over three to five seeds). These facts are used as</w:t>
       </w:r>
       <w:r>
         <w:t xml:space="preserve"> </w:t>
@@ -2865,6 +2865,58 @@
       </w:r>
       <w:r>
         <w:t xml:space="preserve">than no adapter (negative recovery), because the instruct model already scores well without one and the retraining gain is small (0.08 nats). The size of the cost-saving room therefore depends on both upgrade size and model scale, and it is small for the larger models in our sample. That is the regime in which the model recommends free copy.</w:t>
+      </w:r>
+    </w:p>
+    <w:p>
+      <w:pPr>
+        <w:pStyle w:val="BodyText"/>
+      </w:pPr>
+      <w:r>
+        <w:rPr>
+          <w:iCs/>
+          <w:i/>
+        </w:rPr>
+        <w:t xml:space="preserve">Other tasks.</w:t>
+      </w:r>
+      <w:r>
+        <w:t xml:space="preserve"> </w:t>
+      </w:r>
+      <w:r>
+        <w:t xml:space="preserve">We repeated the design on two further tasks, summarization (DialogSum) and text-to-SQL (Online Appendix C, Table C.3). For the small continued-training upgrades of the 160M model, copy again recovered 91 to 97 percent on both tasks, so the default of copying is robust to the task. For the large upgrade the recovery of copy varied with the task (0.40 for math reasoning, 0.35 for summarization, 0.67 for SQL), while the calibration method added a similar 0.28 to 0.32 on each; this gain is large enough for</w:t>
+      </w:r>
+      <w:r>
+        <w:t xml:space="preserve"> </w:t>
+      </w:r>
+      <m:oMath>
+        <m:r>
+          <m:t>Γ</m:t>
+        </m:r>
+      </m:oMath>
+      <w:r>
+        <w:t xml:space="preserve"> </w:t>
+      </w:r>
+      <w:r>
+        <w:t xml:space="preserve">to exceed the reference cost ratio of 0.36 on two of the three tasks (0.45 and 0.82), and is borderline on the third (0.356). In the larger models the picture depends on the task: copy recovered 0.99 on SQL after the large Pythia-1.4B upgrade and 0.79 on math reasoning, but only 0.12 on summarization (three seeds; the interval spans zero), where the calibration method reached 0.28. For base-to-instruct pairs on summarization, copy recovered between</w:t>
+      </w:r>
+      <w:r>
+        <w:t xml:space="preserve"> </w:t>
+      </w:r>
+      <m:oMath>
+        <m:r>
+          <m:rPr>
+            <m:sty m:val="p"/>
+          </m:rPr>
+          <m:t>−</m:t>
+        </m:r>
+        <m:r>
+          <m:t>0.06</m:t>
+        </m:r>
+      </m:oMath>
+      <w:r>
+        <w:t xml:space="preserve"> </w:t>
+      </w:r>
+      <w:r>
+        <w:t xml:space="preserve">and 0.63 and the calibration method never improved on it reliably. These pairs are the cases in which the model recommends retraining: copy is of little use and no tool helps.</w:t>
       </w:r>
     </w:p>
     <w:bookmarkEnd w:id="28"/>
@@ -5220,7 +5272,7 @@
         <w:t xml:space="preserve"> </w:t>
       </w:r>
       <w:r>
-        <w:t xml:space="preserve">is not informative. With any plausible cost ratio, such as the 0.36 measured for the 160M models, no costly method pays in the larger models: free copy is sufficient, which is the prediction of Proposition 2(a).</w:t>
+        <w:t xml:space="preserve">is not informative. With any plausible cost ratio, such as the 0.36 measured for the 160M models, no costly method pays in the larger models on math reasoning or SQL: free copy is sufficient, which is the prediction of Proposition 2(a). Across all 24 pair-task combinations a costly method pays in two (the large upgrade of the 160M model on math reasoning and on SQL), with a third borderline.</w:t>
       </w:r>
     </w:p>
     <w:bookmarkEnd w:id="30"/>
@@ -12364,7 +12416,7 @@
         <w:t xml:space="preserve"> </w:t>
       </w:r>
       <w:r>
-        <w:t xml:space="preserve">Reuse the existing adapter on the new base model first. Proposition 2(a) shows that this weakly dominates retraining immediately for every asset value, because the right to retrain later is kept. In our measurements copy recovered 92 to 99 percent of the retraining gain after small upgrades and 65 to 81 percent for three of the four larger pairs, leaving little for any costly method to add. Compare the copied adapter with running the new model without one: for SmolLM2-1.7B the copy was worse than no adapter, in which case the right default is the base model, not the copy.</w:t>
+        <w:t xml:space="preserve">Reuse the existing adapter on the new base model first. Proposition 2(a) shows that this weakly dominates retraining immediately for every asset value, because the right to retrain later is kept. In our measurements copy recovered 91 to 99 percent of the retraining gain after small upgrades on all three tasks, leaving little for any costly method to add. Treat the default as a first step: measure copy recovery on a sample of adapters. After large upgrades, copy recovered between 12 and 99 percent depending on task and model. Compare the copied adapter with running the new model without one: for SmolLM2-1.7B the copy was worse than no adapter, in which case the right default is the base model, not the copy.</w:t>
       </w:r>
     </w:p>
     <w:p>
@@ -12533,7 +12585,33 @@
         </m:d>
       </m:oMath>
       <w:r>
-        <w:t xml:space="preserve">. That inequality failed in nine of the ten pairs we tested (for the four larger pairs, against the cost ratio of 0.36 measured on the smaller models, since we did not measure CPU costs at that scale). It held only for a large upgrade of a 160M-parameter model, where copy recovered 40 percent. Test copy first on a sample of adapters; if it already recovers most of the gain, do not buy.</w:t>
+        <w:t xml:space="preserve">. That inequality failed in 22 of the 24 pair-task combinations we tested (for the larger pairs, against the cost ratio of 0.36 measured on the smaller models, since we did not measure CPU costs at that scale) and held for the large upgrade of a 160M-parameter model on two tasks. It held only for a large upgrade of a 160M-parameter model, where copy recovered 40 percent. Test copy first on a sample of adapters; if it already recovers most of the gain, do not buy. If copy recovers little and the tool does not beat it by more than its cost, retrain the assets above</w:t>
+      </w:r>
+      <w:r>
+        <w:t xml:space="preserve"> </w:t>
+      </w:r>
+      <m:oMath>
+        <m:sSup>
+          <m:e>
+            <m:r>
+              <m:t>v</m:t>
+            </m:r>
+          </m:e>
+          <m:sup>
+            <m:r>
+              <m:rPr>
+                <m:sty m:val="p"/>
+              </m:rPr>
+              <m:t>*</m:t>
+            </m:r>
+          </m:sup>
+        </m:sSup>
+      </m:oMath>
+      <w:r>
+        <w:t xml:space="preserve"> </w:t>
+      </w:r>
+      <w:r>
+        <w:t xml:space="preserve">instead.</w:t>
       </w:r>
     </w:p>
     <w:p>
@@ -12629,7 +12707,7 @@
         </m:r>
       </m:oMath>
       <w:r>
-        <w:t xml:space="preserve">; the owner’s problem is solved in the static limit, with a dynamic-threshold proxy in Section 7.4; the asymmetric compatibility equilibrium is numerical; the switching game is characterized only to first order; the recovery measurements are small-scale (160M to 3B parameters, one task, five seeds, float32 on one GPU); and open lines can be discontinued. The first empirical priority is</w:t>
+        <w:t xml:space="preserve">; the owner’s problem is solved in the static limit, with a dynamic-threshold proxy in Section 7.4; the asymmetric compatibility equilibrium is numerical; the switching game is characterized only to first order; the recovery measurements are small-scale (160M to 3B parameters, three tasks, three to five seeds, float32 on one GPU, and only two pairs of larger models on the two added tasks); and open lines can be discontinued. The first empirical priority is</w:t>
       </w:r>
       <w:r>
         <w:t xml:space="preserve"> </w:t>
@@ -20993,6 +21071,69 @@
           <w:bCs/>
           <w:b/>
         </w:rPr>
+        <w:t xml:space="preserve">Tasks and protocol.</w:t>
+      </w:r>
+      <w:r>
+        <w:t xml:space="preserve"> </w:t>
+      </w:r>
+      <w:r>
+        <w:t xml:space="preserve">Math reasoning is GSM8K (prompt</w:t>
+      </w:r>
+      <w:r>
+        <w:t xml:space="preserve"> </w:t>
+      </w:r>
+      <w:r>
+        <w:t xml:space="preserve">“</w:t>
+      </w:r>
+      <w:r>
+        <w:t xml:space="preserve">Question: … Answer:</w:t>
+      </w:r>
+      <w:r>
+        <w:t xml:space="preserve">”</w:t>
+      </w:r>
+      <w:r>
+        <w:t xml:space="preserve">). Summarization is DialogSum (prompt</w:t>
+      </w:r>
+      <w:r>
+        <w:t xml:space="preserve"> </w:t>
+      </w:r>
+      <w:r>
+        <w:t xml:space="preserve">“</w:t>
+      </w:r>
+      <w:r>
+        <w:t xml:space="preserve">Summarize the dialogue. … Summary:</w:t>
+      </w:r>
+      <w:r>
+        <w:t xml:space="preserve">”</w:t>
+      </w:r>
+      <w:r>
+        <w:t xml:space="preserve">, evaluation on the test split, maximum length 512 tokens). Text-to-SQL is sql-create-context (prompt</w:t>
+      </w:r>
+      <w:r>
+        <w:t xml:space="preserve"> </w:t>
+      </w:r>
+      <w:r>
+        <w:t xml:space="preserve">“</w:t>
+      </w:r>
+      <w:r>
+        <w:t xml:space="preserve">Schema: … Question: … SQL:</w:t>
+      </w:r>
+      <w:r>
+        <w:t xml:space="preserve">”</w:t>
+      </w:r>
+      <w:r>
+        <w:t xml:space="preserve">); the dataset has no test split, so a fixed pool of 2,000 rows is held out for evaluation and the training and calibration rows of every seed are drawn from the rest. All other settings are as above. A seed is dropped when its retraining gain (the loss without an adapter minus the loss after retraining) is less than half the median gain of the same pair, because the recovery ratio is meaningless when the retraining upper bound has failed; this rule dropped one seed (Pythia-160M +30k on SQL, retraining loss 1.27 against 0.50 to 0.59 for the other seeds) and none in the other cells.</w:t>
+      </w:r>
+    </w:p>
+    <w:p>
+      <w:pPr>
+        <w:pStyle w:val="BodyText"/>
+      </w:pPr>
+      <w:r>
+        <w:rPr>
+          <w:bCs/>
+          <w:b/>
+        </w:rPr>
         <w:t xml:space="preserve">Larger models.</w:t>
       </w:r>
       <w:r>
@@ -21526,6 +21667,2380 @@
         <w:t xml:space="preserve">. The wall-clock cost ratios of these runs are not reported because on a GPU they are dominated by fixed overhead; a CPU measurement at this scale was not run.</w:t>
       </w:r>
     </w:p>
+    <w:p>
+      <w:pPr>
+        <w:pStyle w:val="BodyText"/>
+      </w:pPr>
+      <w:r>
+        <w:rPr>
+          <w:bCs/>
+          <w:b/>
+        </w:rPr>
+        <w:t xml:space="preserve">All tasks.</w:t>
+      </w:r>
+      <w:r>
+        <w:t xml:space="preserve"> </w:t>
+      </w:r>
+      <w:r>
+        <w:t xml:space="preserve">Table C.3 collects every pair-task combination. The cost reference for</w:t>
+      </w:r>
+      <w:r>
+        <w:t xml:space="preserve"> </w:t>
+      </w:r>
+      <m:oMath>
+        <m:r>
+          <m:t>Γ</m:t>
+        </m:r>
+      </m:oMath>
+      <w:r>
+        <w:t xml:space="preserve"> </w:t>
+      </w:r>
+      <w:r>
+        <w:t xml:space="preserve">is the CPU compute-only ratio of the pair for the 160M to 0.5B models and 0.36 for the larger models, and is the same for each task.</w:t>
+      </w:r>
+      <w:r>
+        <w:t xml:space="preserve"> </w:t>
+      </w:r>
+      <m:oMath>
+        <m:r>
+          <m:t>Γ</m:t>
+        </m:r>
+      </m:oMath>
+      <w:r>
+        <w:t xml:space="preserve"> </w:t>
+      </w:r>
+      <w:r>
+        <w:t xml:space="preserve">is computed from the seed-mean recovery rates, clipped to</w:t>
+      </w:r>
+      <w:r>
+        <w:t xml:space="preserve"> </w:t>
+      </w:r>
+      <m:oMath>
+        <m:r>
+          <m:rPr>
+            <m:sty m:val="p"/>
+          </m:rPr>
+          <m:t>[</m:t>
+        </m:r>
+        <m:r>
+          <m:t>0</m:t>
+        </m:r>
+        <m:r>
+          <m:rPr>
+            <m:sty m:val="p"/>
+          </m:rPr>
+          <m:t>,</m:t>
+        </m:r>
+        <m:r>
+          <m:t>1</m:t>
+        </m:r>
+        <m:r>
+          <m:rPr>
+            <m:sty m:val="p"/>
+          </m:rPr>
+          <m:t>)</m:t>
+        </m:r>
+      </m:oMath>
+      <w:r>
+        <w:t xml:space="preserve">, and is set to zero when copy recovers more than 0.95, where it is numerically unstable and copy already recovers essentially everything. The two added tasks use five seeds for the small models and three seeds for the two larger pairs.</w:t>
+      </w:r>
+    </w:p>
+    <w:tbl>
+      <w:tblPr>
+        <w:tblStyle w:val="Table"/>
+        <w:tblW w:type="pct" w:w="5000"/>
+        <w:tblLook w:firstRow="1" w:lastRow="0" w:firstColumn="0" w:lastColumn="0" w:noHBand="0" w:noVBand="0" w:val="0020"/>
+        <w:jc w:val="start"/>
+      </w:tblPr>
+      <w:tblGrid>
+        <w:gridCol w:w="1021"/>
+        <w:gridCol w:w="1021"/>
+        <w:gridCol w:w="1021"/>
+        <w:gridCol w:w="1277"/>
+        <w:gridCol w:w="1277"/>
+        <w:gridCol w:w="1021"/>
+        <w:gridCol w:w="1277"/>
+      </w:tblGrid>
+      <w:tr>
+        <w:trPr>
+          <w:tblHeader w:val="true"/>
+        </w:trPr>
+        <w:tc>
+          <w:tcPr/>
+          <w:p>
+            <w:pPr>
+              <w:pStyle w:val="Compact"/>
+              <w:jc w:val="left"/>
+            </w:pPr>
+            <w:r>
+              <w:t xml:space="preserve">Pair</w:t>
+            </w:r>
+          </w:p>
+        </w:tc>
+        <w:tc>
+          <w:tcPr/>
+          <w:p>
+            <w:pPr>
+              <w:pStyle w:val="Compact"/>
+              <w:jc w:val="left"/>
+            </w:pPr>
+            <w:r>
+              <w:t xml:space="preserve">Task</w:t>
+            </w:r>
+          </w:p>
+        </w:tc>
+        <w:tc>
+          <w:tcPr/>
+          <w:p>
+            <w:pPr>
+              <w:pStyle w:val="Compact"/>
+              <w:jc w:val="right"/>
+            </w:pPr>
+            <w:r>
+              <w:t xml:space="preserve">Seeds</w:t>
+            </w:r>
+          </w:p>
+        </w:tc>
+        <w:tc>
+          <w:tcPr/>
+          <w:p>
+            <w:pPr>
+              <w:pStyle w:val="Compact"/>
+              <w:jc w:val="center"/>
+            </w:pPr>
+            <m:oMath>
+              <m:sSub>
+                <m:e>
+                  <m:r>
+                    <m:t>R</m:t>
+                  </m:r>
+                </m:e>
+                <m:sub>
+                  <m:r>
+                    <m:t>C</m:t>
+                  </m:r>
+                </m:sub>
+              </m:sSub>
+            </m:oMath>
+            <w:r>
+              <w:t xml:space="preserve"> </w:t>
+            </w:r>
+            <w:r>
+              <w:t xml:space="preserve">[95% CI]</w:t>
+            </w:r>
+          </w:p>
+        </w:tc>
+        <w:tc>
+          <w:tcPr/>
+          <w:p>
+            <w:pPr>
+              <w:pStyle w:val="Compact"/>
+              <w:jc w:val="center"/>
+            </w:pPr>
+            <m:oMath>
+              <m:sSub>
+                <m:e>
+                  <m:r>
+                    <m:t>R</m:t>
+                  </m:r>
+                </m:e>
+                <m:sub>
+                  <m:r>
+                    <m:t>A</m:t>
+                  </m:r>
+                </m:sub>
+              </m:sSub>
+            </m:oMath>
+            <w:r>
+              <w:t xml:space="preserve"> </w:t>
+            </w:r>
+            <w:r>
+              <w:t xml:space="preserve">[95% CI]</w:t>
+            </w:r>
+          </w:p>
+        </w:tc>
+        <w:tc>
+          <w:tcPr/>
+          <w:p>
+            <w:pPr>
+              <w:pStyle w:val="Compact"/>
+              <w:jc w:val="right"/>
+            </w:pPr>
+            <m:oMath>
+              <m:r>
+                <m:t>Γ</m:t>
+              </m:r>
+            </m:oMath>
+          </w:p>
+        </w:tc>
+        <w:tc>
+          <w:tcPr/>
+          <w:p>
+            <w:pPr>
+              <w:pStyle w:val="Compact"/>
+              <w:jc w:val="center"/>
+            </w:pPr>
+            <w:r>
+              <w:t xml:space="preserve">Tool pays</w:t>
+            </w:r>
+          </w:p>
+        </w:tc>
+      </w:tr>
+      <w:tr>
+        <w:tc>
+          <w:tcPr/>
+          <w:p>
+            <w:pPr>
+              <w:pStyle w:val="Compact"/>
+              <w:jc w:val="left"/>
+            </w:pPr>
+            <w:r>
+              <w:t xml:space="preserve">pythia-160m +10k</w:t>
+            </w:r>
+          </w:p>
+        </w:tc>
+        <w:tc>
+          <w:tcPr/>
+          <w:p>
+            <w:pPr>
+              <w:pStyle w:val="Compact"/>
+              <w:jc w:val="left"/>
+            </w:pPr>
+            <w:r>
+              <w:t xml:space="preserve">DialogSum</w:t>
+            </w:r>
+          </w:p>
+        </w:tc>
+        <w:tc>
+          <w:tcPr/>
+          <w:p>
+            <w:pPr>
+              <w:pStyle w:val="Compact"/>
+              <w:jc w:val="right"/>
+            </w:pPr>
+            <w:r>
+              <w:t xml:space="preserve">5</w:t>
+            </w:r>
+          </w:p>
+        </w:tc>
+        <w:tc>
+          <w:tcPr/>
+          <w:p>
+            <w:pPr>
+              <w:pStyle w:val="Compact"/>
+              <w:jc w:val="center"/>
+            </w:pPr>
+            <w:r>
+              <w:t xml:space="preserve">0.96 [0.85, 1.06]</w:t>
+            </w:r>
+          </w:p>
+        </w:tc>
+        <w:tc>
+          <w:tcPr/>
+          <w:p>
+            <w:pPr>
+              <w:pStyle w:val="Compact"/>
+              <w:jc w:val="center"/>
+            </w:pPr>
+            <w:r>
+              <w:t xml:space="preserve">0.93 [0.84, 1.03]</w:t>
+            </w:r>
+          </w:p>
+        </w:tc>
+        <w:tc>
+          <w:tcPr/>
+          <w:p>
+            <w:pPr>
+              <w:pStyle w:val="Compact"/>
+              <w:jc w:val="right"/>
+            </w:pPr>
+            <w:r>
+              <w:t xml:space="preserve">0.00</w:t>
+            </w:r>
+          </w:p>
+        </w:tc>
+        <w:tc>
+          <w:tcPr/>
+          <w:p>
+            <w:pPr>
+              <w:pStyle w:val="Compact"/>
+              <w:jc w:val="center"/>
+            </w:pPr>
+            <w:r>
+              <w:t xml:space="preserve">no</w:t>
+            </w:r>
+          </w:p>
+        </w:tc>
+      </w:tr>
+      <w:tr>
+        <w:tc>
+          <w:tcPr/>
+          <w:p>
+            <w:pPr>
+              <w:pStyle w:val="Compact"/>
+              <w:jc w:val="left"/>
+            </w:pPr>
+            <w:r>
+              <w:t xml:space="preserve">pythia-160m +10k</w:t>
+            </w:r>
+          </w:p>
+        </w:tc>
+        <w:tc>
+          <w:tcPr/>
+          <w:p>
+            <w:pPr>
+              <w:pStyle w:val="Compact"/>
+              <w:jc w:val="left"/>
+            </w:pPr>
+            <w:r>
+              <w:t xml:space="preserve">GSM8K</w:t>
+            </w:r>
+          </w:p>
+        </w:tc>
+        <w:tc>
+          <w:tcPr/>
+          <w:p>
+            <w:pPr>
+              <w:pStyle w:val="Compact"/>
+              <w:jc w:val="right"/>
+            </w:pPr>
+            <w:r>
+              <w:t xml:space="preserve">5</w:t>
+            </w:r>
+          </w:p>
+        </w:tc>
+        <w:tc>
+          <w:tcPr/>
+          <w:p>
+            <w:pPr>
+              <w:pStyle w:val="Compact"/>
+              <w:jc w:val="center"/>
+            </w:pPr>
+            <w:r>
+              <w:t xml:space="preserve">0.95 [0.93, 0.97]</w:t>
+            </w:r>
+          </w:p>
+        </w:tc>
+        <w:tc>
+          <w:tcPr/>
+          <w:p>
+            <w:pPr>
+              <w:pStyle w:val="Compact"/>
+              <w:jc w:val="center"/>
+            </w:pPr>
+            <w:r>
+              <w:t xml:space="preserve">0.94 [0.92, 0.97]</w:t>
+            </w:r>
+          </w:p>
+        </w:tc>
+        <w:tc>
+          <w:tcPr/>
+          <w:p>
+            <w:pPr>
+              <w:pStyle w:val="Compact"/>
+              <w:jc w:val="right"/>
+            </w:pPr>
+            <w:r>
+              <w:t xml:space="preserve">0.00</w:t>
+            </w:r>
+          </w:p>
+        </w:tc>
+        <w:tc>
+          <w:tcPr/>
+          <w:p>
+            <w:pPr>
+              <w:pStyle w:val="Compact"/>
+              <w:jc w:val="center"/>
+            </w:pPr>
+            <w:r>
+              <w:t xml:space="preserve">no</w:t>
+            </w:r>
+          </w:p>
+        </w:tc>
+      </w:tr>
+      <w:tr>
+        <w:tc>
+          <w:tcPr/>
+          <w:p>
+            <w:pPr>
+              <w:pStyle w:val="Compact"/>
+              <w:jc w:val="left"/>
+            </w:pPr>
+            <w:r>
+              <w:t xml:space="preserve">pythia-160m +10k</w:t>
+            </w:r>
+          </w:p>
+        </w:tc>
+        <w:tc>
+          <w:tcPr/>
+          <w:p>
+            <w:pPr>
+              <w:pStyle w:val="Compact"/>
+              <w:jc w:val="left"/>
+            </w:pPr>
+            <w:r>
+              <w:t xml:space="preserve">SQL</w:t>
+            </w:r>
+          </w:p>
+        </w:tc>
+        <w:tc>
+          <w:tcPr/>
+          <w:p>
+            <w:pPr>
+              <w:pStyle w:val="Compact"/>
+              <w:jc w:val="right"/>
+            </w:pPr>
+            <w:r>
+              <w:t xml:space="preserve">5</w:t>
+            </w:r>
+          </w:p>
+        </w:tc>
+        <w:tc>
+          <w:tcPr/>
+          <w:p>
+            <w:pPr>
+              <w:pStyle w:val="Compact"/>
+              <w:jc w:val="center"/>
+            </w:pPr>
+            <w:r>
+              <w:t xml:space="preserve">0.97 [0.78, 1.16]</w:t>
+            </w:r>
+          </w:p>
+        </w:tc>
+        <w:tc>
+          <w:tcPr/>
+          <w:p>
+            <w:pPr>
+              <w:pStyle w:val="Compact"/>
+              <w:jc w:val="center"/>
+            </w:pPr>
+            <w:r>
+              <w:t xml:space="preserve">0.97 [0.78, 1.16]</w:t>
+            </w:r>
+          </w:p>
+        </w:tc>
+        <w:tc>
+          <w:tcPr/>
+          <w:p>
+            <w:pPr>
+              <w:pStyle w:val="Compact"/>
+              <w:jc w:val="right"/>
+            </w:pPr>
+            <w:r>
+              <w:t xml:space="preserve">0.00</w:t>
+            </w:r>
+          </w:p>
+        </w:tc>
+        <w:tc>
+          <w:tcPr/>
+          <w:p>
+            <w:pPr>
+              <w:pStyle w:val="Compact"/>
+              <w:jc w:val="center"/>
+            </w:pPr>
+            <w:r>
+              <w:t xml:space="preserve">no</w:t>
+            </w:r>
+          </w:p>
+        </w:tc>
+      </w:tr>
+      <w:tr>
+        <w:tc>
+          <w:tcPr/>
+          <w:p>
+            <w:pPr>
+              <w:pStyle w:val="Compact"/>
+              <w:jc w:val="left"/>
+            </w:pPr>
+            <w:r>
+              <w:t xml:space="preserve">pythia-160m +30k</w:t>
+            </w:r>
+          </w:p>
+        </w:tc>
+        <w:tc>
+          <w:tcPr/>
+          <w:p>
+            <w:pPr>
+              <w:pStyle w:val="Compact"/>
+              <w:jc w:val="left"/>
+            </w:pPr>
+            <w:r>
+              <w:t xml:space="preserve">DialogSum</w:t>
+            </w:r>
+          </w:p>
+        </w:tc>
+        <w:tc>
+          <w:tcPr/>
+          <w:p>
+            <w:pPr>
+              <w:pStyle w:val="Compact"/>
+              <w:jc w:val="right"/>
+            </w:pPr>
+            <w:r>
+              <w:t xml:space="preserve">5</w:t>
+            </w:r>
+          </w:p>
+        </w:tc>
+        <w:tc>
+          <w:tcPr/>
+          <w:p>
+            <w:pPr>
+              <w:pStyle w:val="Compact"/>
+              <w:jc w:val="center"/>
+            </w:pPr>
+            <w:r>
+              <w:t xml:space="preserve">0.91 [0.81, 1.01]</w:t>
+            </w:r>
+          </w:p>
+        </w:tc>
+        <w:tc>
+          <w:tcPr/>
+          <w:p>
+            <w:pPr>
+              <w:pStyle w:val="Compact"/>
+              <w:jc w:val="center"/>
+            </w:pPr>
+            <w:r>
+              <w:t xml:space="preserve">0.91 [0.80, 1.02]</w:t>
+            </w:r>
+          </w:p>
+        </w:tc>
+        <w:tc>
+          <w:tcPr/>
+          <w:p>
+            <w:pPr>
+              <w:pStyle w:val="Compact"/>
+              <w:jc w:val="right"/>
+            </w:pPr>
+            <w:r>
+              <w:t xml:space="preserve">0.03</w:t>
+            </w:r>
+          </w:p>
+        </w:tc>
+        <w:tc>
+          <w:tcPr/>
+          <w:p>
+            <w:pPr>
+              <w:pStyle w:val="Compact"/>
+              <w:jc w:val="center"/>
+            </w:pPr>
+            <w:r>
+              <w:t xml:space="preserve">no</w:t>
+            </w:r>
+          </w:p>
+        </w:tc>
+      </w:tr>
+      <w:tr>
+        <w:tc>
+          <w:tcPr/>
+          <w:p>
+            <w:pPr>
+              <w:pStyle w:val="Compact"/>
+              <w:jc w:val="left"/>
+            </w:pPr>
+            <w:r>
+              <w:t xml:space="preserve">pythia-160m +30k</w:t>
+            </w:r>
+          </w:p>
+        </w:tc>
+        <w:tc>
+          <w:tcPr/>
+          <w:p>
+            <w:pPr>
+              <w:pStyle w:val="Compact"/>
+              <w:jc w:val="left"/>
+            </w:pPr>
+            <w:r>
+              <w:t xml:space="preserve">GSM8K</w:t>
+            </w:r>
+          </w:p>
+        </w:tc>
+        <w:tc>
+          <w:tcPr/>
+          <w:p>
+            <w:pPr>
+              <w:pStyle w:val="Compact"/>
+              <w:jc w:val="right"/>
+            </w:pPr>
+            <w:r>
+              <w:t xml:space="preserve">5</w:t>
+            </w:r>
+          </w:p>
+        </w:tc>
+        <w:tc>
+          <w:tcPr/>
+          <w:p>
+            <w:pPr>
+              <w:pStyle w:val="Compact"/>
+              <w:jc w:val="center"/>
+            </w:pPr>
+            <w:r>
+              <w:t xml:space="preserve">0.92 [0.90, 0.94]</w:t>
+            </w:r>
+          </w:p>
+        </w:tc>
+        <w:tc>
+          <w:tcPr/>
+          <w:p>
+            <w:pPr>
+              <w:pStyle w:val="Compact"/>
+              <w:jc w:val="center"/>
+            </w:pPr>
+            <w:r>
+              <w:t xml:space="preserve">0.94 [0.92, 0.96]</w:t>
+            </w:r>
+          </w:p>
+        </w:tc>
+        <w:tc>
+          <w:tcPr/>
+          <w:p>
+            <w:pPr>
+              <w:pStyle w:val="Compact"/>
+              <w:jc w:val="right"/>
+            </w:pPr>
+            <w:r>
+              <w:t xml:space="preserve">0.12</w:t>
+            </w:r>
+          </w:p>
+        </w:tc>
+        <w:tc>
+          <w:tcPr/>
+          <w:p>
+            <w:pPr>
+              <w:pStyle w:val="Compact"/>
+              <w:jc w:val="center"/>
+            </w:pPr>
+            <w:r>
+              <w:t xml:space="preserve">no</w:t>
+            </w:r>
+          </w:p>
+        </w:tc>
+      </w:tr>
+      <w:tr>
+        <w:tc>
+          <w:tcPr/>
+          <w:p>
+            <w:pPr>
+              <w:pStyle w:val="Compact"/>
+              <w:jc w:val="left"/>
+            </w:pPr>
+            <w:r>
+              <w:t xml:space="preserve">pythia-160m +30k</w:t>
+            </w:r>
+          </w:p>
+        </w:tc>
+        <w:tc>
+          <w:tcPr/>
+          <w:p>
+            <w:pPr>
+              <w:pStyle w:val="Compact"/>
+              <w:jc w:val="left"/>
+            </w:pPr>
+            <w:r>
+              <w:t xml:space="preserve">SQL</w:t>
+            </w:r>
+          </w:p>
+        </w:tc>
+        <w:tc>
+          <w:tcPr/>
+          <w:p>
+            <w:pPr>
+              <w:pStyle w:val="Compact"/>
+              <w:jc w:val="right"/>
+            </w:pPr>
+            <w:r>
+              <w:t xml:space="preserve">4</w:t>
+            </w:r>
+          </w:p>
+        </w:tc>
+        <w:tc>
+          <w:tcPr/>
+          <w:p>
+            <w:pPr>
+              <w:pStyle w:val="Compact"/>
+              <w:jc w:val="center"/>
+            </w:pPr>
+            <w:r>
+              <w:t xml:space="preserve">0.95 [0.76, 1.14]</w:t>
+            </w:r>
+          </w:p>
+        </w:tc>
+        <w:tc>
+          <w:tcPr/>
+          <w:p>
+            <w:pPr>
+              <w:pStyle w:val="Compact"/>
+              <w:jc w:val="center"/>
+            </w:pPr>
+            <w:r>
+              <w:t xml:space="preserve">0.96 [0.77, 1.15]</w:t>
+            </w:r>
+          </w:p>
+        </w:tc>
+        <w:tc>
+          <w:tcPr/>
+          <w:p>
+            <w:pPr>
+              <w:pStyle w:val="Compact"/>
+              <w:jc w:val="right"/>
+            </w:pPr>
+            <w:r>
+              <w:t xml:space="preserve">0.24</w:t>
+            </w:r>
+          </w:p>
+        </w:tc>
+        <w:tc>
+          <w:tcPr/>
+          <w:p>
+            <w:pPr>
+              <w:pStyle w:val="Compact"/>
+              <w:jc w:val="center"/>
+            </w:pPr>
+            <w:r>
+              <w:t xml:space="preserve">no</w:t>
+            </w:r>
+          </w:p>
+        </w:tc>
+      </w:tr>
+      <w:tr>
+        <w:tc>
+          <w:tcPr/>
+          <w:p>
+            <w:pPr>
+              <w:pStyle w:val="Compact"/>
+              <w:jc w:val="left"/>
+            </w:pPr>
+            <w:r>
+              <w:t xml:space="preserve">pythia-160m +70k</w:t>
+            </w:r>
+          </w:p>
+        </w:tc>
+        <w:tc>
+          <w:tcPr/>
+          <w:p>
+            <w:pPr>
+              <w:pStyle w:val="Compact"/>
+              <w:jc w:val="left"/>
+            </w:pPr>
+            <w:r>
+              <w:t xml:space="preserve">DialogSum</w:t>
+            </w:r>
+          </w:p>
+        </w:tc>
+        <w:tc>
+          <w:tcPr/>
+          <w:p>
+            <w:pPr>
+              <w:pStyle w:val="Compact"/>
+              <w:jc w:val="right"/>
+            </w:pPr>
+            <w:r>
+              <w:t xml:space="preserve">5</w:t>
+            </w:r>
+          </w:p>
+        </w:tc>
+        <w:tc>
+          <w:tcPr/>
+          <w:p>
+            <w:pPr>
+              <w:pStyle w:val="Compact"/>
+              <w:jc w:val="center"/>
+            </w:pPr>
+            <w:r>
+              <w:t xml:space="preserve">0.35 [0.22, 0.48]</w:t>
+            </w:r>
+          </w:p>
+        </w:tc>
+        <w:tc>
+          <w:tcPr/>
+          <w:p>
+            <w:pPr>
+              <w:pStyle w:val="Compact"/>
+              <w:jc w:val="center"/>
+            </w:pPr>
+            <w:r>
+              <w:t xml:space="preserve">0.64 [0.54, 0.73]</w:t>
+            </w:r>
+          </w:p>
+        </w:tc>
+        <w:tc>
+          <w:tcPr/>
+          <w:p>
+            <w:pPr>
+              <w:pStyle w:val="Compact"/>
+              <w:jc w:val="right"/>
+            </w:pPr>
+            <w:r>
+              <w:t xml:space="preserve">0.36</w:t>
+            </w:r>
+          </w:p>
+        </w:tc>
+        <w:tc>
+          <w:tcPr/>
+          <w:p>
+            <w:pPr>
+              <w:pStyle w:val="Compact"/>
+              <w:jc w:val="center"/>
+            </w:pPr>
+            <w:r>
+              <w:t xml:space="preserve">no</w:t>
+            </w:r>
+          </w:p>
+        </w:tc>
+      </w:tr>
+      <w:tr>
+        <w:tc>
+          <w:tcPr/>
+          <w:p>
+            <w:pPr>
+              <w:pStyle w:val="Compact"/>
+              <w:jc w:val="left"/>
+            </w:pPr>
+            <w:r>
+              <w:t xml:space="preserve">pythia-160m +70k</w:t>
+            </w:r>
+          </w:p>
+        </w:tc>
+        <w:tc>
+          <w:tcPr/>
+          <w:p>
+            <w:pPr>
+              <w:pStyle w:val="Compact"/>
+              <w:jc w:val="left"/>
+            </w:pPr>
+            <w:r>
+              <w:t xml:space="preserve">GSM8K</w:t>
+            </w:r>
+          </w:p>
+        </w:tc>
+        <w:tc>
+          <w:tcPr/>
+          <w:p>
+            <w:pPr>
+              <w:pStyle w:val="Compact"/>
+              <w:jc w:val="right"/>
+            </w:pPr>
+            <w:r>
+              <w:t xml:space="preserve">5</w:t>
+            </w:r>
+          </w:p>
+        </w:tc>
+        <w:tc>
+          <w:tcPr/>
+          <w:p>
+            <w:pPr>
+              <w:pStyle w:val="Compact"/>
+              <w:jc w:val="center"/>
+            </w:pPr>
+            <w:r>
+              <w:t xml:space="preserve">0.40 [0.31, 0.50]</w:t>
+            </w:r>
+          </w:p>
+        </w:tc>
+        <w:tc>
+          <w:tcPr/>
+          <w:p>
+            <w:pPr>
+              <w:pStyle w:val="Compact"/>
+              <w:jc w:val="center"/>
+            </w:pPr>
+            <w:r>
+              <w:t xml:space="preserve">0.72 [0.64, 0.81]</w:t>
+            </w:r>
+          </w:p>
+        </w:tc>
+        <w:tc>
+          <w:tcPr/>
+          <w:p>
+            <w:pPr>
+              <w:pStyle w:val="Compact"/>
+              <w:jc w:val="right"/>
+            </w:pPr>
+            <w:r>
+              <w:t xml:space="preserve">0.45</w:t>
+            </w:r>
+          </w:p>
+        </w:tc>
+        <w:tc>
+          <w:tcPr/>
+          <w:p>
+            <w:pPr>
+              <w:pStyle w:val="Compact"/>
+              <w:jc w:val="center"/>
+            </w:pPr>
+            <w:r>
+              <w:t xml:space="preserve">yes</w:t>
+            </w:r>
+          </w:p>
+        </w:tc>
+      </w:tr>
+      <w:tr>
+        <w:tc>
+          <w:tcPr/>
+          <w:p>
+            <w:pPr>
+              <w:pStyle w:val="Compact"/>
+              <w:jc w:val="left"/>
+            </w:pPr>
+            <w:r>
+              <w:t xml:space="preserve">pythia-160m +70k</w:t>
+            </w:r>
+          </w:p>
+        </w:tc>
+        <w:tc>
+          <w:tcPr/>
+          <w:p>
+            <w:pPr>
+              <w:pStyle w:val="Compact"/>
+              <w:jc w:val="left"/>
+            </w:pPr>
+            <w:r>
+              <w:t xml:space="preserve">SQL</w:t>
+            </w:r>
+          </w:p>
+        </w:tc>
+        <w:tc>
+          <w:tcPr/>
+          <w:p>
+            <w:pPr>
+              <w:pStyle w:val="Compact"/>
+              <w:jc w:val="right"/>
+            </w:pPr>
+            <w:r>
+              <w:t xml:space="preserve">5</w:t>
+            </w:r>
+          </w:p>
+        </w:tc>
+        <w:tc>
+          <w:tcPr/>
+          <w:p>
+            <w:pPr>
+              <w:pStyle w:val="Compact"/>
+              <w:jc w:val="center"/>
+            </w:pPr>
+            <w:r>
+              <w:t xml:space="preserve">0.67 [0.54, 0.81]</w:t>
+            </w:r>
+          </w:p>
+        </w:tc>
+        <w:tc>
+          <w:tcPr/>
+          <w:p>
+            <w:pPr>
+              <w:pStyle w:val="Compact"/>
+              <w:jc w:val="center"/>
+            </w:pPr>
+            <w:r>
+              <w:t xml:space="preserve">0.95 [0.88, 1.03]</w:t>
+            </w:r>
+          </w:p>
+        </w:tc>
+        <w:tc>
+          <w:tcPr/>
+          <w:p>
+            <w:pPr>
+              <w:pStyle w:val="Compact"/>
+              <w:jc w:val="right"/>
+            </w:pPr>
+            <w:r>
+              <w:t xml:space="preserve">0.82</w:t>
+            </w:r>
+          </w:p>
+        </w:tc>
+        <w:tc>
+          <w:tcPr/>
+          <w:p>
+            <w:pPr>
+              <w:pStyle w:val="Compact"/>
+              <w:jc w:val="center"/>
+            </w:pPr>
+            <w:r>
+              <w:t xml:space="preserve">yes</w:t>
+            </w:r>
+          </w:p>
+        </w:tc>
+      </w:tr>
+      <w:tr>
+        <w:tc>
+          <w:tcPr/>
+          <w:p>
+            <w:pPr>
+              <w:pStyle w:val="Compact"/>
+              <w:jc w:val="left"/>
+            </w:pPr>
+            <w:r>
+              <w:t xml:space="preserve">smollm2-360m instr</w:t>
+            </w:r>
+          </w:p>
+        </w:tc>
+        <w:tc>
+          <w:tcPr/>
+          <w:p>
+            <w:pPr>
+              <w:pStyle w:val="Compact"/>
+              <w:jc w:val="left"/>
+            </w:pPr>
+            <w:r>
+              <w:t xml:space="preserve">DialogSum</w:t>
+            </w:r>
+          </w:p>
+        </w:tc>
+        <w:tc>
+          <w:tcPr/>
+          <w:p>
+            <w:pPr>
+              <w:pStyle w:val="Compact"/>
+              <w:jc w:val="right"/>
+            </w:pPr>
+            <w:r>
+              <w:t xml:space="preserve">5</w:t>
+            </w:r>
+          </w:p>
+        </w:tc>
+        <w:tc>
+          <w:tcPr/>
+          <w:p>
+            <w:pPr>
+              <w:pStyle w:val="Compact"/>
+              <w:jc w:val="center"/>
+            </w:pPr>
+            <w:r>
+              <w:t xml:space="preserve">0.63 [0.57, 0.68]</w:t>
+            </w:r>
+          </w:p>
+        </w:tc>
+        <w:tc>
+          <w:tcPr/>
+          <w:p>
+            <w:pPr>
+              <w:pStyle w:val="Compact"/>
+              <w:jc w:val="center"/>
+            </w:pPr>
+            <w:r>
+              <w:t xml:space="preserve">0.60 [0.55, 0.65]</w:t>
+            </w:r>
+          </w:p>
+        </w:tc>
+        <w:tc>
+          <w:tcPr/>
+          <w:p>
+            <w:pPr>
+              <w:pStyle w:val="Compact"/>
+              <w:jc w:val="right"/>
+            </w:pPr>
+            <w:r>
+              <w:t xml:space="preserve">0.00</w:t>
+            </w:r>
+          </w:p>
+        </w:tc>
+        <w:tc>
+          <w:tcPr/>
+          <w:p>
+            <w:pPr>
+              <w:pStyle w:val="Compact"/>
+              <w:jc w:val="center"/>
+            </w:pPr>
+            <w:r>
+              <w:t xml:space="preserve">no</w:t>
+            </w:r>
+          </w:p>
+        </w:tc>
+      </w:tr>
+      <w:tr>
+        <w:tc>
+          <w:tcPr/>
+          <w:p>
+            <w:pPr>
+              <w:pStyle w:val="Compact"/>
+              <w:jc w:val="left"/>
+            </w:pPr>
+            <w:r>
+              <w:t xml:space="preserve">smollm2-360m instr</w:t>
+            </w:r>
+          </w:p>
+        </w:tc>
+        <w:tc>
+          <w:tcPr/>
+          <w:p>
+            <w:pPr>
+              <w:pStyle w:val="Compact"/>
+              <w:jc w:val="left"/>
+            </w:pPr>
+            <w:r>
+              <w:t xml:space="preserve">GSM8K</w:t>
+            </w:r>
+          </w:p>
+        </w:tc>
+        <w:tc>
+          <w:tcPr/>
+          <w:p>
+            <w:pPr>
+              <w:pStyle w:val="Compact"/>
+              <w:jc w:val="right"/>
+            </w:pPr>
+            <w:r>
+              <w:t xml:space="preserve">5</w:t>
+            </w:r>
+          </w:p>
+        </w:tc>
+        <w:tc>
+          <w:tcPr/>
+          <w:p>
+            <w:pPr>
+              <w:pStyle w:val="Compact"/>
+              <w:jc w:val="center"/>
+            </w:pPr>
+            <w:r>
+              <w:t xml:space="preserve">0.73 [0.70, 0.77]</w:t>
+            </w:r>
+          </w:p>
+        </w:tc>
+        <w:tc>
+          <w:tcPr/>
+          <w:p>
+            <w:pPr>
+              <w:pStyle w:val="Compact"/>
+              <w:jc w:val="center"/>
+            </w:pPr>
+            <w:r>
+              <w:t xml:space="preserve">0.73 [0.69, 0.77]</w:t>
+            </w:r>
+          </w:p>
+        </w:tc>
+        <w:tc>
+          <w:tcPr/>
+          <w:p>
+            <w:pPr>
+              <w:pStyle w:val="Compact"/>
+              <w:jc w:val="right"/>
+            </w:pPr>
+            <w:r>
+              <w:t xml:space="preserve">0.00</w:t>
+            </w:r>
+          </w:p>
+        </w:tc>
+        <w:tc>
+          <w:tcPr/>
+          <w:p>
+            <w:pPr>
+              <w:pStyle w:val="Compact"/>
+              <w:jc w:val="center"/>
+            </w:pPr>
+            <w:r>
+              <w:t xml:space="preserve">no</w:t>
+            </w:r>
+          </w:p>
+        </w:tc>
+      </w:tr>
+      <w:tr>
+        <w:tc>
+          <w:tcPr/>
+          <w:p>
+            <w:pPr>
+              <w:pStyle w:val="Compact"/>
+              <w:jc w:val="left"/>
+            </w:pPr>
+            <w:r>
+              <w:t xml:space="preserve">smollm2-360m instr</w:t>
+            </w:r>
+          </w:p>
+        </w:tc>
+        <w:tc>
+          <w:tcPr/>
+          <w:p>
+            <w:pPr>
+              <w:pStyle w:val="Compact"/>
+              <w:jc w:val="left"/>
+            </w:pPr>
+            <w:r>
+              <w:t xml:space="preserve">SQL</w:t>
+            </w:r>
+          </w:p>
+        </w:tc>
+        <w:tc>
+          <w:tcPr/>
+          <w:p>
+            <w:pPr>
+              <w:pStyle w:val="Compact"/>
+              <w:jc w:val="right"/>
+            </w:pPr>
+            <w:r>
+              <w:t xml:space="preserve">5</w:t>
+            </w:r>
+          </w:p>
+        </w:tc>
+        <w:tc>
+          <w:tcPr/>
+          <w:p>
+            <w:pPr>
+              <w:pStyle w:val="Compact"/>
+              <w:jc w:val="center"/>
+            </w:pPr>
+            <w:r>
+              <w:t xml:space="preserve">0.89 [0.82, 0.96]</w:t>
+            </w:r>
+          </w:p>
+        </w:tc>
+        <w:tc>
+          <w:tcPr/>
+          <w:p>
+            <w:pPr>
+              <w:pStyle w:val="Compact"/>
+              <w:jc w:val="center"/>
+            </w:pPr>
+            <w:r>
+              <w:t xml:space="preserve">0.90 [0.84, 0.96]</w:t>
+            </w:r>
+          </w:p>
+        </w:tc>
+        <w:tc>
+          <w:tcPr/>
+          <w:p>
+            <w:pPr>
+              <w:pStyle w:val="Compact"/>
+              <w:jc w:val="right"/>
+            </w:pPr>
+            <w:r>
+              <w:t xml:space="preserve">0.04</w:t>
+            </w:r>
+          </w:p>
+        </w:tc>
+        <w:tc>
+          <w:tcPr/>
+          <w:p>
+            <w:pPr>
+              <w:pStyle w:val="Compact"/>
+              <w:jc w:val="center"/>
+            </w:pPr>
+            <w:r>
+              <w:t xml:space="preserve">no</w:t>
+            </w:r>
+          </w:p>
+        </w:tc>
+      </w:tr>
+      <w:tr>
+        <w:tc>
+          <w:tcPr/>
+          <w:p>
+            <w:pPr>
+              <w:pStyle w:val="Compact"/>
+              <w:jc w:val="left"/>
+            </w:pPr>
+            <w:r>
+              <w:t xml:space="preserve">qwen2.5-0.5b instr</w:t>
+            </w:r>
+          </w:p>
+        </w:tc>
+        <w:tc>
+          <w:tcPr/>
+          <w:p>
+            <w:pPr>
+              <w:pStyle w:val="Compact"/>
+              <w:jc w:val="left"/>
+            </w:pPr>
+            <w:r>
+              <w:t xml:space="preserve">DialogSum</w:t>
+            </w:r>
+          </w:p>
+        </w:tc>
+        <w:tc>
+          <w:tcPr/>
+          <w:p>
+            <w:pPr>
+              <w:pStyle w:val="Compact"/>
+              <w:jc w:val="right"/>
+            </w:pPr>
+            <w:r>
+              <w:t xml:space="preserve">5</w:t>
+            </w:r>
+          </w:p>
+        </w:tc>
+        <w:tc>
+          <w:tcPr/>
+          <w:p>
+            <w:pPr>
+              <w:pStyle w:val="Compact"/>
+              <w:jc w:val="center"/>
+            </w:pPr>
+            <w:r>
+              <w:t xml:space="preserve">-0.06 [-0.39, 0.27]</w:t>
+            </w:r>
+          </w:p>
+        </w:tc>
+        <w:tc>
+          <w:tcPr/>
+          <w:p>
+            <w:pPr>
+              <w:pStyle w:val="Compact"/>
+              <w:jc w:val="center"/>
+            </w:pPr>
+            <w:r>
+              <w:t xml:space="preserve">-0.04 [-0.33, 0.26]</w:t>
+            </w:r>
+          </w:p>
+        </w:tc>
+        <w:tc>
+          <w:tcPr/>
+          <w:p>
+            <w:pPr>
+              <w:pStyle w:val="Compact"/>
+              <w:jc w:val="right"/>
+            </w:pPr>
+            <w:r>
+              <w:t xml:space="preserve">0.00</w:t>
+            </w:r>
+          </w:p>
+        </w:tc>
+        <w:tc>
+          <w:tcPr/>
+          <w:p>
+            <w:pPr>
+              <w:pStyle w:val="Compact"/>
+              <w:jc w:val="center"/>
+            </w:pPr>
+            <w:r>
+              <w:t xml:space="preserve">no</w:t>
+            </w:r>
+          </w:p>
+        </w:tc>
+      </w:tr>
+      <w:tr>
+        <w:tc>
+          <w:tcPr/>
+          <w:p>
+            <w:pPr>
+              <w:pStyle w:val="Compact"/>
+              <w:jc w:val="left"/>
+            </w:pPr>
+            <w:r>
+              <w:t xml:space="preserve">qwen2.5-0.5b instr</w:t>
+            </w:r>
+          </w:p>
+        </w:tc>
+        <w:tc>
+          <w:tcPr/>
+          <w:p>
+            <w:pPr>
+              <w:pStyle w:val="Compact"/>
+              <w:jc w:val="left"/>
+            </w:pPr>
+            <w:r>
+              <w:t xml:space="preserve">GSM8K</w:t>
+            </w:r>
+          </w:p>
+        </w:tc>
+        <w:tc>
+          <w:tcPr/>
+          <w:p>
+            <w:pPr>
+              <w:pStyle w:val="Compact"/>
+              <w:jc w:val="right"/>
+            </w:pPr>
+            <w:r>
+              <w:t xml:space="preserve">5</w:t>
+            </w:r>
+          </w:p>
+        </w:tc>
+        <w:tc>
+          <w:tcPr/>
+          <w:p>
+            <w:pPr>
+              <w:pStyle w:val="Compact"/>
+              <w:jc w:val="center"/>
+            </w:pPr>
+            <w:r>
+              <w:t xml:space="preserve">0.74 [0.57, 0.92]</w:t>
+            </w:r>
+          </w:p>
+        </w:tc>
+        <w:tc>
+          <w:tcPr/>
+          <w:p>
+            <w:pPr>
+              <w:pStyle w:val="Compact"/>
+              <w:jc w:val="center"/>
+            </w:pPr>
+            <w:r>
+              <w:t xml:space="preserve">0.78 [0.61, 0.95]</w:t>
+            </w:r>
+          </w:p>
+        </w:tc>
+        <w:tc>
+          <w:tcPr/>
+          <w:p>
+            <w:pPr>
+              <w:pStyle w:val="Compact"/>
+              <w:jc w:val="right"/>
+            </w:pPr>
+            <w:r>
+              <w:t xml:space="preserve">0.10</w:t>
+            </w:r>
+          </w:p>
+        </w:tc>
+        <w:tc>
+          <w:tcPr/>
+          <w:p>
+            <w:pPr>
+              <w:pStyle w:val="Compact"/>
+              <w:jc w:val="center"/>
+            </w:pPr>
+            <w:r>
+              <w:t xml:space="preserve">no</w:t>
+            </w:r>
+          </w:p>
+        </w:tc>
+      </w:tr>
+      <w:tr>
+        <w:tc>
+          <w:tcPr/>
+          <w:p>
+            <w:pPr>
+              <w:pStyle w:val="Compact"/>
+              <w:jc w:val="left"/>
+            </w:pPr>
+            <w:r>
+              <w:t xml:space="preserve">qwen2.5-0.5b instr</w:t>
+            </w:r>
+          </w:p>
+        </w:tc>
+        <w:tc>
+          <w:tcPr/>
+          <w:p>
+            <w:pPr>
+              <w:pStyle w:val="Compact"/>
+              <w:jc w:val="left"/>
+            </w:pPr>
+            <w:r>
+              <w:t xml:space="preserve">SQL</w:t>
+            </w:r>
+          </w:p>
+        </w:tc>
+        <w:tc>
+          <w:tcPr/>
+          <w:p>
+            <w:pPr>
+              <w:pStyle w:val="Compact"/>
+              <w:jc w:val="right"/>
+            </w:pPr>
+            <w:r>
+              <w:t xml:space="preserve">5</w:t>
+            </w:r>
+          </w:p>
+        </w:tc>
+        <w:tc>
+          <w:tcPr/>
+          <w:p>
+            <w:pPr>
+              <w:pStyle w:val="Compact"/>
+              <w:jc w:val="center"/>
+            </w:pPr>
+            <w:r>
+              <w:t xml:space="preserve">0.76 [0.65, 0.88]</w:t>
+            </w:r>
+          </w:p>
+        </w:tc>
+        <w:tc>
+          <w:tcPr/>
+          <w:p>
+            <w:pPr>
+              <w:pStyle w:val="Compact"/>
+              <w:jc w:val="center"/>
+            </w:pPr>
+            <w:r>
+              <w:t xml:space="preserve">0.77 [0.65, 0.88]</w:t>
+            </w:r>
+          </w:p>
+        </w:tc>
+        <w:tc>
+          <w:tcPr/>
+          <w:p>
+            <w:pPr>
+              <w:pStyle w:val="Compact"/>
+              <w:jc w:val="right"/>
+            </w:pPr>
+            <w:r>
+              <w:t xml:space="preserve">0.01</w:t>
+            </w:r>
+          </w:p>
+        </w:tc>
+        <w:tc>
+          <w:tcPr/>
+          <w:p>
+            <w:pPr>
+              <w:pStyle w:val="Compact"/>
+              <w:jc w:val="center"/>
+            </w:pPr>
+            <w:r>
+              <w:t xml:space="preserve">no</w:t>
+            </w:r>
+          </w:p>
+        </w:tc>
+      </w:tr>
+      <w:tr>
+        <w:tc>
+          <w:tcPr/>
+          <w:p>
+            <w:pPr>
+              <w:pStyle w:val="Compact"/>
+              <w:jc w:val="left"/>
+            </w:pPr>
+            <w:r>
+              <w:t xml:space="preserve">pythia-1.4b +10k</w:t>
+            </w:r>
+          </w:p>
+        </w:tc>
+        <w:tc>
+          <w:tcPr/>
+          <w:p>
+            <w:pPr>
+              <w:pStyle w:val="Compact"/>
+              <w:jc w:val="left"/>
+            </w:pPr>
+            <w:r>
+              <w:t xml:space="preserve">GSM8K</w:t>
+            </w:r>
+          </w:p>
+        </w:tc>
+        <w:tc>
+          <w:tcPr/>
+          <w:p>
+            <w:pPr>
+              <w:pStyle w:val="Compact"/>
+              <w:jc w:val="right"/>
+            </w:pPr>
+            <w:r>
+              <w:t xml:space="preserve">5</w:t>
+            </w:r>
+          </w:p>
+        </w:tc>
+        <w:tc>
+          <w:tcPr/>
+          <w:p>
+            <w:pPr>
+              <w:pStyle w:val="Compact"/>
+              <w:jc w:val="center"/>
+            </w:pPr>
+            <w:r>
+              <w:t xml:space="preserve">0.99 [0.95, 1.03]</w:t>
+            </w:r>
+          </w:p>
+        </w:tc>
+        <w:tc>
+          <w:tcPr/>
+          <w:p>
+            <w:pPr>
+              <w:pStyle w:val="Compact"/>
+              <w:jc w:val="center"/>
+            </w:pPr>
+            <w:r>
+              <w:t xml:space="preserve">0.99 [0.95, 1.03]</w:t>
+            </w:r>
+          </w:p>
+        </w:tc>
+        <w:tc>
+          <w:tcPr/>
+          <w:p>
+            <w:pPr>
+              <w:pStyle w:val="Compact"/>
+              <w:jc w:val="right"/>
+            </w:pPr>
+            <w:r>
+              <w:t xml:space="preserve">0.00</w:t>
+            </w:r>
+          </w:p>
+        </w:tc>
+        <w:tc>
+          <w:tcPr/>
+          <w:p>
+            <w:pPr>
+              <w:pStyle w:val="Compact"/>
+              <w:jc w:val="center"/>
+            </w:pPr>
+            <w:r>
+              <w:t xml:space="preserve">no</w:t>
+            </w:r>
+          </w:p>
+        </w:tc>
+      </w:tr>
+      <w:tr>
+        <w:tc>
+          <w:tcPr/>
+          <w:p>
+            <w:pPr>
+              <w:pStyle w:val="Compact"/>
+              <w:jc w:val="left"/>
+            </w:pPr>
+            <w:r>
+              <w:t xml:space="preserve">pythia-1.4b +70k</w:t>
+            </w:r>
+          </w:p>
+        </w:tc>
+        <w:tc>
+          <w:tcPr/>
+          <w:p>
+            <w:pPr>
+              <w:pStyle w:val="Compact"/>
+              <w:jc w:val="left"/>
+            </w:pPr>
+            <w:r>
+              <w:t xml:space="preserve">DialogSum</w:t>
+            </w:r>
+          </w:p>
+        </w:tc>
+        <w:tc>
+          <w:tcPr/>
+          <w:p>
+            <w:pPr>
+              <w:pStyle w:val="Compact"/>
+              <w:jc w:val="right"/>
+            </w:pPr>
+            <w:r>
+              <w:t xml:space="preserve">3</w:t>
+            </w:r>
+          </w:p>
+        </w:tc>
+        <w:tc>
+          <w:tcPr/>
+          <w:p>
+            <w:pPr>
+              <w:pStyle w:val="Compact"/>
+              <w:jc w:val="center"/>
+            </w:pPr>
+            <w:r>
+              <w:t xml:space="preserve">0.12 [-0.37, 0.62]</w:t>
+            </w:r>
+          </w:p>
+        </w:tc>
+        <w:tc>
+          <w:tcPr/>
+          <w:p>
+            <w:pPr>
+              <w:pStyle w:val="Compact"/>
+              <w:jc w:val="center"/>
+            </w:pPr>
+            <w:r>
+              <w:t xml:space="preserve">0.28 [-0.16, 0.72]</w:t>
+            </w:r>
+          </w:p>
+        </w:tc>
+        <w:tc>
+          <w:tcPr/>
+          <w:p>
+            <w:pPr>
+              <w:pStyle w:val="Compact"/>
+              <w:jc w:val="right"/>
+            </w:pPr>
+            <w:r>
+              <w:t xml:space="preserve">0.12</w:t>
+            </w:r>
+          </w:p>
+        </w:tc>
+        <w:tc>
+          <w:tcPr/>
+          <w:p>
+            <w:pPr>
+              <w:pStyle w:val="Compact"/>
+              <w:jc w:val="center"/>
+            </w:pPr>
+            <w:r>
+              <w:t xml:space="preserve">no</w:t>
+            </w:r>
+          </w:p>
+        </w:tc>
+      </w:tr>
+      <w:tr>
+        <w:tc>
+          <w:tcPr/>
+          <w:p>
+            <w:pPr>
+              <w:pStyle w:val="Compact"/>
+              <w:jc w:val="left"/>
+            </w:pPr>
+            <w:r>
+              <w:t xml:space="preserve">pythia-1.4b +70k</w:t>
+            </w:r>
+          </w:p>
+        </w:tc>
+        <w:tc>
+          <w:tcPr/>
+          <w:p>
+            <w:pPr>
+              <w:pStyle w:val="Compact"/>
+              <w:jc w:val="left"/>
+            </w:pPr>
+            <w:r>
+              <w:t xml:space="preserve">GSM8K</w:t>
+            </w:r>
+          </w:p>
+        </w:tc>
+        <w:tc>
+          <w:tcPr/>
+          <w:p>
+            <w:pPr>
+              <w:pStyle w:val="Compact"/>
+              <w:jc w:val="right"/>
+            </w:pPr>
+            <w:r>
+              <w:t xml:space="preserve">5</w:t>
+            </w:r>
+          </w:p>
+        </w:tc>
+        <w:tc>
+          <w:tcPr/>
+          <w:p>
+            <w:pPr>
+              <w:pStyle w:val="Compact"/>
+              <w:jc w:val="center"/>
+            </w:pPr>
+            <w:r>
+              <w:t xml:space="preserve">0.79 [0.72, 0.85]</w:t>
+            </w:r>
+          </w:p>
+        </w:tc>
+        <w:tc>
+          <w:tcPr/>
+          <w:p>
+            <w:pPr>
+              <w:pStyle w:val="Compact"/>
+              <w:jc w:val="center"/>
+            </w:pPr>
+            <w:r>
+              <w:t xml:space="preserve">0.81 [0.75, 0.86]</w:t>
+            </w:r>
+          </w:p>
+        </w:tc>
+        <w:tc>
+          <w:tcPr/>
+          <w:p>
+            <w:pPr>
+              <w:pStyle w:val="Compact"/>
+              <w:jc w:val="right"/>
+            </w:pPr>
+            <w:r>
+              <w:t xml:space="preserve">0.07</w:t>
+            </w:r>
+          </w:p>
+        </w:tc>
+        <w:tc>
+          <w:tcPr/>
+          <w:p>
+            <w:pPr>
+              <w:pStyle w:val="Compact"/>
+              <w:jc w:val="center"/>
+            </w:pPr>
+            <w:r>
+              <w:t xml:space="preserve">no</w:t>
+            </w:r>
+          </w:p>
+        </w:tc>
+      </w:tr>
+      <w:tr>
+        <w:tc>
+          <w:tcPr/>
+          <w:p>
+            <w:pPr>
+              <w:pStyle w:val="Compact"/>
+              <w:jc w:val="left"/>
+            </w:pPr>
+            <w:r>
+              <w:t xml:space="preserve">pythia-1.4b +70k</w:t>
+            </w:r>
+          </w:p>
+        </w:tc>
+        <w:tc>
+          <w:tcPr/>
+          <w:p>
+            <w:pPr>
+              <w:pStyle w:val="Compact"/>
+              <w:jc w:val="left"/>
+            </w:pPr>
+            <w:r>
+              <w:t xml:space="preserve">SQL</w:t>
+            </w:r>
+          </w:p>
+        </w:tc>
+        <w:tc>
+          <w:tcPr/>
+          <w:p>
+            <w:pPr>
+              <w:pStyle w:val="Compact"/>
+              <w:jc w:val="right"/>
+            </w:pPr>
+            <w:r>
+              <w:t xml:space="preserve">3</w:t>
+            </w:r>
+          </w:p>
+        </w:tc>
+        <w:tc>
+          <w:tcPr/>
+          <w:p>
+            <w:pPr>
+              <w:pStyle w:val="Compact"/>
+              <w:jc w:val="center"/>
+            </w:pPr>
+            <w:r>
+              <w:t xml:space="preserve">0.99 [0.91, 1.08]</w:t>
+            </w:r>
+          </w:p>
+        </w:tc>
+        <w:tc>
+          <w:tcPr/>
+          <w:p>
+            <w:pPr>
+              <w:pStyle w:val="Compact"/>
+              <w:jc w:val="center"/>
+            </w:pPr>
+            <w:r>
+              <w:t xml:space="preserve">0.99 [0.90, 1.09]</w:t>
+            </w:r>
+          </w:p>
+        </w:tc>
+        <w:tc>
+          <w:tcPr/>
+          <w:p>
+            <w:pPr>
+              <w:pStyle w:val="Compact"/>
+              <w:jc w:val="right"/>
+            </w:pPr>
+            <w:r>
+              <w:t xml:space="preserve">0.00</w:t>
+            </w:r>
+          </w:p>
+        </w:tc>
+        <w:tc>
+          <w:tcPr/>
+          <w:p>
+            <w:pPr>
+              <w:pStyle w:val="Compact"/>
+              <w:jc w:val="center"/>
+            </w:pPr>
+            <w:r>
+              <w:t xml:space="preserve">no</w:t>
+            </w:r>
+          </w:p>
+        </w:tc>
+      </w:tr>
+      <w:tr>
+        <w:tc>
+          <w:tcPr/>
+          <w:p>
+            <w:pPr>
+              <w:pStyle w:val="Compact"/>
+              <w:jc w:val="left"/>
+            </w:pPr>
+            <w:r>
+              <w:t xml:space="preserve">qwen2.5-1.5b instr</w:t>
+            </w:r>
+          </w:p>
+        </w:tc>
+        <w:tc>
+          <w:tcPr/>
+          <w:p>
+            <w:pPr>
+              <w:pStyle w:val="Compact"/>
+              <w:jc w:val="left"/>
+            </w:pPr>
+            <w:r>
+              <w:t xml:space="preserve">DialogSum</w:t>
+            </w:r>
+          </w:p>
+        </w:tc>
+        <w:tc>
+          <w:tcPr/>
+          <w:p>
+            <w:pPr>
+              <w:pStyle w:val="Compact"/>
+              <w:jc w:val="right"/>
+            </w:pPr>
+            <w:r>
+              <w:t xml:space="preserve">3</w:t>
+            </w:r>
+          </w:p>
+        </w:tc>
+        <w:tc>
+          <w:tcPr/>
+          <w:p>
+            <w:pPr>
+              <w:pStyle w:val="Compact"/>
+              <w:jc w:val="center"/>
+            </w:pPr>
+            <w:r>
+              <w:t xml:space="preserve">0.22 [-0.47, 0.91]</w:t>
+            </w:r>
+          </w:p>
+        </w:tc>
+        <w:tc>
+          <w:tcPr/>
+          <w:p>
+            <w:pPr>
+              <w:pStyle w:val="Compact"/>
+              <w:jc w:val="center"/>
+            </w:pPr>
+            <w:r>
+              <w:t xml:space="preserve">0.09 [-0.56, 0.75]</w:t>
+            </w:r>
+          </w:p>
+        </w:tc>
+        <w:tc>
+          <w:tcPr/>
+          <w:p>
+            <w:pPr>
+              <w:pStyle w:val="Compact"/>
+              <w:jc w:val="right"/>
+            </w:pPr>
+            <w:r>
+              <w:t xml:space="preserve">0.00</w:t>
+            </w:r>
+          </w:p>
+        </w:tc>
+        <w:tc>
+          <w:tcPr/>
+          <w:p>
+            <w:pPr>
+              <w:pStyle w:val="Compact"/>
+              <w:jc w:val="center"/>
+            </w:pPr>
+            <w:r>
+              <w:t xml:space="preserve">no</w:t>
+            </w:r>
+          </w:p>
+        </w:tc>
+      </w:tr>
+      <w:tr>
+        <w:tc>
+          <w:tcPr/>
+          <w:p>
+            <w:pPr>
+              <w:pStyle w:val="Compact"/>
+              <w:jc w:val="left"/>
+            </w:pPr>
+            <w:r>
+              <w:t xml:space="preserve">qwen2.5-1.5b instr</w:t>
+            </w:r>
+          </w:p>
+        </w:tc>
+        <w:tc>
+          <w:tcPr/>
+          <w:p>
+            <w:pPr>
+              <w:pStyle w:val="Compact"/>
+              <w:jc w:val="left"/>
+            </w:pPr>
+            <w:r>
+              <w:t xml:space="preserve">GSM8K</w:t>
+            </w:r>
+          </w:p>
+        </w:tc>
+        <w:tc>
+          <w:tcPr/>
+          <w:p>
+            <w:pPr>
+              <w:pStyle w:val="Compact"/>
+              <w:jc w:val="right"/>
+            </w:pPr>
+            <w:r>
+              <w:t xml:space="preserve">5</w:t>
+            </w:r>
+          </w:p>
+        </w:tc>
+        <w:tc>
+          <w:tcPr/>
+          <w:p>
+            <w:pPr>
+              <w:pStyle w:val="Compact"/>
+              <w:jc w:val="center"/>
+            </w:pPr>
+            <w:r>
+              <w:t xml:space="preserve">0.81 [0.58, 1.04]</w:t>
+            </w:r>
+          </w:p>
+        </w:tc>
+        <w:tc>
+          <w:tcPr/>
+          <w:p>
+            <w:pPr>
+              <w:pStyle w:val="Compact"/>
+              <w:jc w:val="center"/>
+            </w:pPr>
+            <w:r>
+              <w:t xml:space="preserve">0.82 [0.59, 1.05]</w:t>
+            </w:r>
+          </w:p>
+        </w:tc>
+        <w:tc>
+          <w:tcPr/>
+          <w:p>
+            <w:pPr>
+              <w:pStyle w:val="Compact"/>
+              <w:jc w:val="right"/>
+            </w:pPr>
+            <w:r>
+              <w:t xml:space="preserve">0.04</w:t>
+            </w:r>
+          </w:p>
+        </w:tc>
+        <w:tc>
+          <w:tcPr/>
+          <w:p>
+            <w:pPr>
+              <w:pStyle w:val="Compact"/>
+              <w:jc w:val="center"/>
+            </w:pPr>
+            <w:r>
+              <w:t xml:space="preserve">no</w:t>
+            </w:r>
+          </w:p>
+        </w:tc>
+      </w:tr>
+      <w:tr>
+        <w:tc>
+          <w:tcPr/>
+          <w:p>
+            <w:pPr>
+              <w:pStyle w:val="Compact"/>
+              <w:jc w:val="left"/>
+            </w:pPr>
+            <w:r>
+              <w:t xml:space="preserve">qwen2.5-1.5b instr</w:t>
+            </w:r>
+          </w:p>
+        </w:tc>
+        <w:tc>
+          <w:tcPr/>
+          <w:p>
+            <w:pPr>
+              <w:pStyle w:val="Compact"/>
+              <w:jc w:val="left"/>
+            </w:pPr>
+            <w:r>
+              <w:t xml:space="preserve">SQL</w:t>
+            </w:r>
+          </w:p>
+        </w:tc>
+        <w:tc>
+          <w:tcPr/>
+          <w:p>
+            <w:pPr>
+              <w:pStyle w:val="Compact"/>
+              <w:jc w:val="right"/>
+            </w:pPr>
+            <w:r>
+              <w:t xml:space="preserve">3</w:t>
+            </w:r>
+          </w:p>
+        </w:tc>
+        <w:tc>
+          <w:tcPr/>
+          <w:p>
+            <w:pPr>
+              <w:pStyle w:val="Compact"/>
+              <w:jc w:val="center"/>
+            </w:pPr>
+            <w:r>
+              <w:t xml:space="preserve">0.92 [0.72, 1.12]</w:t>
+            </w:r>
+          </w:p>
+        </w:tc>
+        <w:tc>
+          <w:tcPr/>
+          <w:p>
+            <w:pPr>
+              <w:pStyle w:val="Compact"/>
+              <w:jc w:val="center"/>
+            </w:pPr>
+            <w:r>
+              <w:t xml:space="preserve">0.92 [0.71, 1.12]</w:t>
+            </w:r>
+          </w:p>
+        </w:tc>
+        <w:tc>
+          <w:tcPr/>
+          <w:p>
+            <w:pPr>
+              <w:pStyle w:val="Compact"/>
+              <w:jc w:val="right"/>
+            </w:pPr>
+            <w:r>
+              <w:t xml:space="preserve">0.00</w:t>
+            </w:r>
+          </w:p>
+        </w:tc>
+        <w:tc>
+          <w:tcPr/>
+          <w:p>
+            <w:pPr>
+              <w:pStyle w:val="Compact"/>
+              <w:jc w:val="center"/>
+            </w:pPr>
+            <w:r>
+              <w:t xml:space="preserve">no</w:t>
+            </w:r>
+          </w:p>
+        </w:tc>
+      </w:tr>
+      <w:tr>
+        <w:tc>
+          <w:tcPr/>
+          <w:p>
+            <w:pPr>
+              <w:pStyle w:val="Compact"/>
+              <w:jc w:val="left"/>
+            </w:pPr>
+            <w:r>
+              <w:t xml:space="preserve">smollm2-1.7b instr</w:t>
+            </w:r>
+          </w:p>
+        </w:tc>
+        <w:tc>
+          <w:tcPr/>
+          <w:p>
+            <w:pPr>
+              <w:pStyle w:val="Compact"/>
+              <w:jc w:val="left"/>
+            </w:pPr>
+            <w:r>
+              <w:t xml:space="preserve">GSM8K</w:t>
+            </w:r>
+          </w:p>
+        </w:tc>
+        <w:tc>
+          <w:tcPr/>
+          <w:p>
+            <w:pPr>
+              <w:pStyle w:val="Compact"/>
+              <w:jc w:val="right"/>
+            </w:pPr>
+            <w:r>
+              <w:t xml:space="preserve">5</w:t>
+            </w:r>
+          </w:p>
+        </w:tc>
+        <w:tc>
+          <w:tcPr/>
+          <w:p>
+            <w:pPr>
+              <w:pStyle w:val="Compact"/>
+              <w:jc w:val="center"/>
+            </w:pPr>
+            <w:r>
+              <w:t xml:space="preserve">-1.32 [-1.79, -0.85]</w:t>
+            </w:r>
+          </w:p>
+        </w:tc>
+        <w:tc>
+          <w:tcPr/>
+          <w:p>
+            <w:pPr>
+              <w:pStyle w:val="Compact"/>
+              <w:jc w:val="center"/>
+            </w:pPr>
+            <w:r>
+              <w:t xml:space="preserve">-1.45 [-1.99, -0.91]</w:t>
+            </w:r>
+          </w:p>
+        </w:tc>
+        <w:tc>
+          <w:tcPr/>
+          <w:p>
+            <w:pPr>
+              <w:pStyle w:val="Compact"/>
+              <w:jc w:val="right"/>
+            </w:pPr>
+            <w:r>
+              <w:t xml:space="preserve">0.00</w:t>
+            </w:r>
+          </w:p>
+        </w:tc>
+        <w:tc>
+          <w:tcPr/>
+          <w:p>
+            <w:pPr>
+              <w:pStyle w:val="Compact"/>
+              <w:jc w:val="center"/>
+            </w:pPr>
+            <w:r>
+              <w:t xml:space="preserve">no</w:t>
+            </w:r>
+          </w:p>
+        </w:tc>
+      </w:tr>
+      <w:tr>
+        <w:tc>
+          <w:tcPr/>
+          <w:p>
+            <w:pPr>
+              <w:pStyle w:val="Compact"/>
+              <w:jc w:val="left"/>
+            </w:pPr>
+            <w:r>
+              <w:t xml:space="preserve">qwen2.5-3b instr</w:t>
+            </w:r>
+          </w:p>
+        </w:tc>
+        <w:tc>
+          <w:tcPr/>
+          <w:p>
+            <w:pPr>
+              <w:pStyle w:val="Compact"/>
+              <w:jc w:val="left"/>
+            </w:pPr>
+            <w:r>
+              <w:t xml:space="preserve">GSM8K</w:t>
+            </w:r>
+          </w:p>
+        </w:tc>
+        <w:tc>
+          <w:tcPr/>
+          <w:p>
+            <w:pPr>
+              <w:pStyle w:val="Compact"/>
+              <w:jc w:val="right"/>
+            </w:pPr>
+            <w:r>
+              <w:t xml:space="preserve">4</w:t>
+            </w:r>
+          </w:p>
+        </w:tc>
+        <w:tc>
+          <w:tcPr/>
+          <w:p>
+            <w:pPr>
+              <w:pStyle w:val="Compact"/>
+              <w:jc w:val="center"/>
+            </w:pPr>
+            <w:r>
+              <w:t xml:space="preserve">0.65 [0.40, 0.89]</w:t>
+            </w:r>
+          </w:p>
+        </w:tc>
+        <w:tc>
+          <w:tcPr/>
+          <w:p>
+            <w:pPr>
+              <w:pStyle w:val="Compact"/>
+              <w:jc w:val="center"/>
+            </w:pPr>
+            <w:r>
+              <w:t xml:space="preserve">0.62 [0.36, 0.89]</w:t>
+            </w:r>
+          </w:p>
+        </w:tc>
+        <w:tc>
+          <w:tcPr/>
+          <w:p>
+            <w:pPr>
+              <w:pStyle w:val="Compact"/>
+              <w:jc w:val="right"/>
+            </w:pPr>
+            <w:r>
+              <w:t xml:space="preserve">0.00</w:t>
+            </w:r>
+          </w:p>
+        </w:tc>
+        <w:tc>
+          <w:tcPr/>
+          <w:p>
+            <w:pPr>
+              <w:pStyle w:val="Compact"/>
+              <w:jc w:val="center"/>
+            </w:pPr>
+            <w:r>
+              <w:t xml:space="preserve">no</w:t>
+            </w:r>
+          </w:p>
+        </w:tc>
+      </w:tr>
+    </w:tbl>
+    <w:p>
+      <w:pPr>
+        <w:pStyle w:val="BodyText"/>
+      </w:pPr>
+      <w:r>
+        <w:rPr>
+          <w:iCs/>
+          <w:i/>
+        </w:rPr>
+        <w:t xml:space="preserve">Table C.3. Recovery and the bound</w:t>
+      </w:r>
+      <w:r>
+        <w:rPr>
+          <w:iCs/>
+          <w:i/>
+        </w:rPr>
+        <w:t xml:space="preserve"> </w:t>
+      </w:r>
+      <m:oMath>
+        <m:r>
+          <m:t>Γ</m:t>
+        </m:r>
+      </m:oMath>
+      <w:r>
+        <w:rPr>
+          <w:iCs/>
+          <w:i/>
+        </w:rPr>
+        <w:t xml:space="preserve"> </w:t>
+      </w:r>
+      <w:r>
+        <w:rPr>
+          <w:iCs/>
+          <w:i/>
+        </w:rPr>
+        <w:t xml:space="preserve">for 24 pair-task combinations.</w:t>
+      </w:r>
+      <w:r>
+        <w:t xml:space="preserve"> </w:t>
+      </w:r>
+      <w:r>
+        <w:t xml:space="preserve">“</w:t>
+      </w:r>
+      <w:r>
+        <w:t xml:space="preserve">Tool pays</w:t>
+      </w:r>
+      <w:r>
+        <w:t xml:space="preserve">”</w:t>
+      </w:r>
+      <w:r>
+        <w:t xml:space="preserve"> </w:t>
+      </w:r>
+      <w:r>
+        <w:t xml:space="preserve">means</w:t>
+      </w:r>
+      <w:r>
+        <w:t xml:space="preserve"> </w:t>
+      </w:r>
+      <m:oMath>
+        <m:r>
+          <m:t>Γ</m:t>
+        </m:r>
+      </m:oMath>
+      <w:r>
+        <w:t xml:space="preserve"> </w:t>
+      </w:r>
+      <w:r>
+        <w:t xml:space="preserve">exceeds the cost reference; it is borderline for Pythia-160M +70k on DialogSum (</w:t>
+      </w:r>
+      <m:oMath>
+        <m:r>
+          <m:t>Γ</m:t>
+        </m:r>
+        <m:r>
+          <m:rPr>
+            <m:sty m:val="p"/>
+          </m:rPr>
+          <m:t>=</m:t>
+        </m:r>
+        <m:r>
+          <m:t>0.356</m:t>
+        </m:r>
+      </m:oMath>
+      <w:r>
+        <w:t xml:space="preserve"> </w:t>
+      </w:r>
+      <w:r>
+        <w:t xml:space="preserve">against 0.359).</w:t>
+      </w:r>
+    </w:p>
     <w:bookmarkEnd w:id="59"/>
     <w:bookmarkStart w:id="60" w:name="appendix-d.-date-verification"/>
     <w:p>
@@ -21834,7 +24349,7 @@
         <w:pStyle w:val="FirstParagraph"/>
       </w:pPr>
       <w:r>
-        <w:t xml:space="preserve">The replication package contains the release-history file, the intensity-estimation script, the robustness script, the owner-model and dynamic-threshold scripts, the figure script, and saved numerical output. It does not contain weights or training logs from the five small-model pairs; those are calibration inputs described in Appendix C. The package also contains the multi-seed driver, the aggregation script, the parameter-grid script of Appendix F, and the per-seed result files. No proprietary or subscription data are used. An anonymized copy of the package will be provided to reviewers on request.</w:t>
+        <w:t xml:space="preserve">The replication package contains the release-history file, the intensity-estimation script, the robustness script, the owner-model and dynamic-threshold scripts, the figure script, and saved numerical output. It does not contain weights or training logs from the five small-model pairs; those are calibration inputs described in Appendix C. The package also contains the multi-seed driver, the aggregation script, the parameter-grid script of Appendix F, the task-combination script, and the per-seed result files. No proprietary or subscription data are used. An anonymized copy of the package will be provided to reviewers on request.</w:t>
       </w:r>
     </w:p>
     <w:bookmarkEnd w:id="61"/>

</xml_diff>